<commit_message>
docs(req): alinear Visión, CU, HU y diagramas con la arquitectura (T-086, #38)
</commit_message>
<xml_diff>
--- a/02_req/editablesWORD/ChuroViaje_Casos_de_Uso.docx
+++ b/02_req/editablesWORD/ChuroViaje_Casos_de_Uso.docx
@@ -197,7 +197,7 @@
           </w:tcPr>
           <w:p>
             <w:r>
-              <w:t xml:space="preserve">06/10/2026</w:t>
+              <w:t xml:space="preserve">13/10/2026</w:t>
             </w:r>
           </w:p>
         </w:tc>
@@ -730,7 +730,7 @@
           </w:tcPr>
           <w:p>
             <w:r>
-              <w:t xml:space="preserve">Permite al conductor reportar un evento vial (choque, control, congestión, etc.), indicando hace cuánto ocurrió, para que sea validado, persistido en el backend y visible en pocos segundos para los demás usuarios conectados.</w:t>
+              <w:t xml:space="preserve">Permite al conductor reportar un evento vial (accidente, control policial, bloqueo u otro; la congestión no se reporta, la detecta el sistema), indicando hace cuánto ocurrió, para que sea validado, persistido en el backend y visible en pocos segundos para los demás usuarios conectados.</w:t>
             </w:r>
           </w:p>
         </w:tc>
@@ -1158,7 +1158,7 @@
           </w:tcPr>
           <w:p>
             <w:r>
-              <w:t xml:space="preserve">El conductor selecciona el tipo de evento (choque, control, etc.) y, si hace falta, cambia el tiempo ("Ahora mismo", "Hace 10 minutos" u "Hace 1 hora").</w:t>
+              <w:t xml:space="preserve">El conductor selecciona el tipo de evento (accidente, control policial, bloqueo u otro) y, si hace falta, cambia el tiempo ("Ahora mismo", "Hace 10 minutos" u "Hace 30 minutos").</w:t>
             </w:r>
           </w:p>
         </w:tc>
@@ -1169,7 +1169,7 @@
           </w:tcPr>
           <w:p>
             <w:r>
-              <w:t>El sistema captura la ubicación GPS actual del dispositivo.</w:t>
+              <w:t xml:space="preserve">El sistema registra el tipo y el tiempo elegidos.</w:t>
             </w:r>
           </w:p>
         </w:tc>
@@ -1213,7 +1213,7 @@
           </w:tcPr>
           <w:p>
             <w:r>
-              <w:t xml:space="preserve">El sistema envía al backend el reporte con el tipo de evento, el momento en que ocurrió y la ubicación, para su validación.</w:t>
+              <w:t xml:space="preserve">El sistema captura la ubicación GPS actual del dispositivo y envía al backend el reporte con el tipo de evento, la hora de confirmación, el tiempo elegido y la ubicación, para su validación.</w:t>
             </w:r>
           </w:p>
         </w:tc>
@@ -1330,7 +1330,7 @@
         </w:rPr>
         <w:drawing>
           <wp:inline distT="0" distB="0" distL="0" distR="0" wp14:anchorId="1944ADEA" wp14:editId="7AD0A5DF">
-            <wp:extent cx="3897091" cy="7315200"/>
+            <wp:extent cx="3757294" cy="7315200"/>
             <wp:effectExtent l="0" t="0" r="0" b="0"/>
             <wp:docPr id="502" name="CU-01_actividad.png"/>
             <wp:cNvGraphicFramePr>
@@ -1352,7 +1352,7 @@
                   <pic:spPr>
                     <a:xfrm>
                       <a:off x="0" y="0"/>
-                      <a:ext cx="3897091" cy="7315200"/>
+                      <a:ext cx="3757294" cy="7315200"/>
                     </a:xfrm>
                     <a:prstGeom prst="rect">
                       <a:avLst/>
@@ -1588,7 +1588,7 @@
           </w:tcPr>
           <w:p>
             <w:r>
-              <w:t xml:space="preserve">1. El sistema solicita reautenticación (CU-08).</w:t>
+              <w:t xml:space="preserve">1. El sistema intenta renovar la sesión sin que el conductor intervenga; si no puede, solicita reautenticación (CU-08).</w:t>
             </w:r>
           </w:p>
           <w:p>
@@ -1599,6 +1599,55 @@
           <w:p>
             <w:r>
               <w:t>3. El sistema reintenta el envío del reporte.</w:t>
+            </w:r>
+          </w:p>
+        </w:tc>
+      </w:tr>
+      <w:tr>
+        <w:tblPrEx>
+          <w:tblCellMar>
+            <w:top w:w="0" w:type="dxa"/>
+            <w:bottom w:w="0" w:type="dxa"/>
+          </w:tblCellMar>
+        </w:tblPrEx>
+        <w:trPr>
+          <w:cantSplit/>
+        </w:trPr>
+        <w:tc>
+          <w:tcPr>
+            <w:tcW w:w="900" w:type="dxa"/>
+            <w:vAlign w:val="center"/>
+          </w:tcPr>
+          <w:p>
+            <w:r>
+              <w:t xml:space="preserve">4b</w:t>
+            </w:r>
+          </w:p>
+        </w:tc>
+        <w:tc>
+          <w:tcPr>
+            <w:tcW w:w="3730" w:type="dxa"/>
+            <w:vAlign w:val="center"/>
+          </w:tcPr>
+          <w:p>
+            <w:r>
+              <w:t xml:space="preserve">El backend rechaza el reporte (ubicación fuera de Tarija, evento ya vencido, reporte repetido o límite de reportes superado):</w:t>
+            </w:r>
+          </w:p>
+        </w:tc>
+        <w:tc>
+          <w:tcPr>
+            <w:tcW w:w="4730" w:type="dxa"/>
+            <w:vAlign w:val="center"/>
+          </w:tcPr>
+          <w:p>
+            <w:r>
+              <w:t xml:space="preserve">1. El sistema muestra al conductor el motivo del rechazo.</w:t>
+            </w:r>
+          </w:p>
+          <w:p>
+            <w:r>
+              <w:t xml:space="preserve">2. El reporte no se registra.</w:t>
             </w:r>
           </w:p>
         </w:tc>
@@ -1653,7 +1702,7 @@
         <w:spacing w:after="80"/>
       </w:pPr>
       <w:r>
-        <w:t xml:space="preserve">Paso 2: la ubicación puede obtenerse por GPS del dispositivo o, si este falla, mediante ajuste manual sobre el mapa.</w:t>
+        <w:t xml:space="preserve">Paso 3: la ubicación puede obtenerse por GPS del dispositivo o, si este falla, mediante ajuste manual sobre el mapa.</w:t>
       </w:r>
     </w:p>
     <w:p>
@@ -1861,7 +1910,7 @@
           </w:tcPr>
           <w:p>
             <w:r>
-              <w:t xml:space="preserve">06/10/2026</w:t>
+              <w:t xml:space="preserve">13/10/2026</w:t>
             </w:r>
           </w:p>
         </w:tc>
@@ -2228,7 +2277,7 @@
               </w:numPr>
             </w:pPr>
             <w:r>
-              <w:t xml:space="preserve">Existe conexión a internet activa.</w:t>
+              <w:t xml:space="preserve">Para ver eventos actualizados hace falta conexión a internet; sin ella se aplica la garantía mínima.</w:t>
             </w:r>
           </w:p>
         </w:tc>
@@ -2273,7 +2322,7 @@
               </w:numPr>
             </w:pPr>
             <w:r>
-              <w:t>El mapa muestra los eventos viales vigentes, categorizados por color según su tipo (p. ej. rojo para choques, azul para controles).</w:t>
+              <w:t xml:space="preserve">El mapa muestra los eventos viales vigentes, categorizados por color según su tipo (p. ej. rojo para accidentes, azul para controles).</w:t>
             </w:r>
           </w:p>
         </w:tc>
@@ -2995,7 +3044,7 @@
         </w:rPr>
         <w:drawing>
           <wp:inline distT="0" distB="0" distL="0" distR="0" wp14:anchorId="45E60579" wp14:editId="71D14171">
-            <wp:extent cx="3480909" cy="7315200"/>
+            <wp:extent cx="3369165" cy="7315200"/>
             <wp:effectExtent l="0" t="0" r="0" b="0"/>
             <wp:docPr id="504" name="CU-02_actividad.png"/>
             <wp:cNvGraphicFramePr>
@@ -3017,7 +3066,7 @@
                   <pic:spPr>
                     <a:xfrm>
                       <a:off x="0" y="0"/>
-                      <a:ext cx="3480909" cy="7315200"/>
+                      <a:ext cx="3369165" cy="7315200"/>
                     </a:xfrm>
                     <a:prstGeom prst="rect">
                       <a:avLst/>
@@ -3293,17 +3342,17 @@
           </w:tcPr>
           <w:p>
             <w:r>
-              <w:t xml:space="preserve">1. El backend registra el voto; cada conductor vota una sola vez por evento.</w:t>
-            </w:r>
-          </w:p>
-          <w:p>
-            <w:r>
-              <w:t xml:space="preserve">2. Si el evento acumula la cantidad de votos "falso" definida, el backend lo retira y desaparece del mapa en la siguiente actualización.</w:t>
-            </w:r>
-          </w:p>
-          <w:p>
-            <w:r>
-              <w:t xml:space="preserve">3. Si el evento recibe votos "real", queda marcado como confirmado.</w:t>
+              <w:t xml:space="preserve">1. El backend registra el voto; cada conductor vota una sola vez por evento, no puede votar su propio evento y la congestión que detecta el sistema no se vota.</w:t>
+            </w:r>
+          </w:p>
+          <w:p>
+            <w:r>
+              <w:t xml:space="preserve">2. Si el evento acumula la cantidad de votos "falso" definida (sección 8), el backend lo retira y desaparece del mapa en la siguiente actualización.</w:t>
+            </w:r>
+          </w:p>
+          <w:p>
+            <w:r>
+              <w:t xml:space="preserve">3. Si el evento acumula la cantidad de votos "real" definida (sección 8), queda marcado como confirmado y ya no se retira por votos; solo vence.</w:t>
             </w:r>
           </w:p>
         </w:tc>
@@ -3374,7 +3423,7 @@
         <w:spacing w:after="80"/>
       </w:pPr>
       <w:r>
-        <w:t xml:space="preserve">Vigencia de los eventos, contada desde el momento en que ocurrieron (valores iniciales, a ajustar con las pruebas): congestión, 30 minutos; choque y control, 60 minutos; cualquier otro tipo, 60 minutos hasta que se defina.</w:t>
+        <w:t xml:space="preserve">Vigencia de los eventos, contada desde el momento en que ocurrieron (valores iniciales, a ajustar con las pruebas): congestión, 30 minutos; accidente, control policial, bloqueo y otro, 60 minutos.</w:t>
       </w:r>
     </w:p>
     <w:p>
@@ -3382,7 +3431,7 @@
         <w:spacing w:after="80"/>
       </w:pPr>
       <w:r>
-        <w:t xml:space="preserve">La cantidad de votos "falso" necesaria para retirar un evento se definirá durante la Construcción.</w:t>
+        <w:t xml:space="preserve">Con 3 votos "falso" un evento se retira, y con 3 votos "real" queda confirmado (valores iniciales, a ajustar con las pruebas).</w:t>
       </w:r>
     </w:p>
     <w:p>
@@ -3582,7 +3631,7 @@
           </w:tcPr>
           <w:p>
             <w:r>
-              <w:t xml:space="preserve">06/10/2026</w:t>
+              <w:t xml:space="preserve">13/10/2026</w:t>
             </w:r>
           </w:p>
         </w:tc>
@@ -3949,7 +3998,7 @@
               </w:numPr>
             </w:pPr>
             <w:r>
-              <w:t xml:space="preserve">Existe conexión con el backend y con el servicio de Mapbox.</w:t>
+              <w:t xml:space="preserve">Existe conexión con el backend.</w:t>
             </w:r>
           </w:p>
         </w:tc>
@@ -4077,7 +4126,7 @@
               </w:numPr>
             </w:pPr>
             <w:r>
-              <w:t xml:space="preserve">Motor core (C++): ejecuta el algoritmo de grafos (Dijkstra o A* modificado).</w:t>
+              <w:t xml:space="preserve">Motor core (núcleo en C++ con una cara en Java): ejecuta el algoritmo de grafos (A*, con Dijkstra como alternativa) sobre la red de calles de Tarija, tomada de un extracto de OpenStreetMap.</w:t>
             </w:r>
           </w:p>
           <w:p>
@@ -4089,7 +4138,19 @@
               </w:numPr>
             </w:pPr>
             <w:r>
-              <w:t>Mapbox: provee los datos viales y de mapa base.</w:t>
+              <w:t xml:space="preserve">Backend Java: recibe la solicitud, valida los puntos y la pasa al motor core.</w:t>
+            </w:r>
+          </w:p>
+          <w:p>
+            <w:pPr>
+              <w:pStyle w:val="Prrafodelista"/>
+              <w:numPr>
+                <w:ilvl w:val="0"/>
+                <w:numId w:val="2"/>
+              </w:numPr>
+            </w:pPr>
+            <w:r>
+              <w:t xml:space="preserve">Mapbox: provee el mapa base que ve el conductor.</w:t>
             </w:r>
           </w:p>
         </w:tc>
@@ -4156,7 +4217,7 @@
         </w:rPr>
         <w:drawing>
           <wp:inline distT="0" distB="0" distL="0" distR="0" wp14:anchorId="7DC87677" wp14:editId="0E75BD2D">
-            <wp:extent cx="4574286" cy="2688336"/>
+            <wp:extent cx="4574286" cy="3137535"/>
             <wp:effectExtent l="0" t="0" r="0" b="0"/>
             <wp:docPr id="505" name="CU-03_casos_de_uso.png"/>
             <wp:cNvGraphicFramePr>
@@ -4178,7 +4239,7 @@
                   <pic:spPr>
                     <a:xfrm>
                       <a:off x="0" y="0"/>
-                      <a:ext cx="4574286" cy="2688336"/>
+                      <a:ext cx="4574286" cy="3137535"/>
                     </a:xfrm>
                     <a:prstGeom prst="rect">
                       <a:avLst/>
@@ -4566,7 +4627,7 @@
           </w:tcPr>
           <w:p>
             <w:r>
-              <w:t xml:space="preserve">El sistema envía la solicitud al motor core.</w:t>
+              <w:t xml:space="preserve">El backend valida la solicitud y la envía al motor core.</w:t>
             </w:r>
           </w:p>
         </w:tc>
@@ -4610,7 +4671,7 @@
           </w:tcPr>
           <w:p>
             <w:r>
-              <w:t xml:space="preserve">El motor core obtiene datos viales de Mapbox y ejecuta el algoritmo (Dijkstra/A*) para generar la ruta óptima.</w:t>
+              <w:t xml:space="preserve">El motor core ajusta los puntos a la red de calles que tiene en memoria y ejecuta el algoritmo (A*) para generar la ruta óptima, considerando los eventos viales vigentes.</w:t>
             </w:r>
           </w:p>
         </w:tc>
@@ -4727,7 +4788,7 @@
         </w:rPr>
         <w:drawing>
           <wp:inline distT="0" distB="0" distL="0" distR="0" wp14:anchorId="55E72A42" wp14:editId="204D07AF">
-            <wp:extent cx="5943600" cy="6521265"/>
+            <wp:extent cx="5943600" cy="6553982"/>
             <wp:effectExtent l="0" t="0" r="0" b="0"/>
             <wp:docPr id="506" name="CU-03_actividad.png"/>
             <wp:cNvGraphicFramePr>
@@ -4749,7 +4810,7 @@
                   <pic:spPr>
                     <a:xfrm>
                       <a:off x="0" y="0"/>
-                      <a:ext cx="5943600" cy="6521265"/>
+                      <a:ext cx="5943600" cy="6553982"/>
                     </a:xfrm>
                     <a:prstGeom prst="rect">
                       <a:avLst/>
@@ -4954,7 +5015,7 @@
           </w:tcPr>
           <w:p>
             <w:r>
-              <w:t>3a</w:t>
+              <w:t xml:space="preserve">3a</w:t>
             </w:r>
           </w:p>
         </w:tc>
@@ -4965,7 +5026,7 @@
           </w:tcPr>
           <w:p>
             <w:r>
-              <w:t xml:space="preserve">El servicio de Mapbox no está disponible:</w:t>
+              <w:t>No existe una ruta vehicular posible entre los puntos indicados:</w:t>
             </w:r>
           </w:p>
         </w:tc>
@@ -4976,56 +5037,56 @@
           </w:tcPr>
           <w:p>
             <w:r>
+              <w:t>1. El sistema notifica que no se encontró una ruta válida.</w:t>
+            </w:r>
+          </w:p>
+        </w:tc>
+      </w:tr>
+      <w:tr>
+        <w:tblPrEx>
+          <w:tblCellMar>
+            <w:top w:w="0" w:type="dxa"/>
+            <w:bottom w:w="0" w:type="dxa"/>
+          </w:tblCellMar>
+        </w:tblPrEx>
+        <w:trPr>
+          <w:cantSplit/>
+        </w:trPr>
+        <w:tc>
+          <w:tcPr>
+            <w:tcW w:w="900" w:type="dxa"/>
+            <w:vAlign w:val="center"/>
+          </w:tcPr>
+          <w:p>
+            <w:r>
+              <w:t xml:space="preserve">4a</w:t>
+            </w:r>
+          </w:p>
+        </w:tc>
+        <w:tc>
+          <w:tcPr>
+            <w:tcW w:w="3730" w:type="dxa"/>
+            <w:vAlign w:val="center"/>
+          </w:tcPr>
+          <w:p>
+            <w:r>
+              <w:t xml:space="preserve">El mapa base de Mapbox no carga al dibujar la ruta:</w:t>
+            </w:r>
+          </w:p>
+        </w:tc>
+        <w:tc>
+          <w:tcPr>
+            <w:tcW w:w="4730" w:type="dxa"/>
+            <w:vAlign w:val="center"/>
+          </w:tcPr>
+          <w:p>
+            <w:r>
               <w:t>1. El sistema informa un error de servicio externo.</w:t>
             </w:r>
           </w:p>
           <w:p>
             <w:r>
-              <w:t>2. Sugiere reintentar más tarde.</w:t>
-            </w:r>
-          </w:p>
-        </w:tc>
-      </w:tr>
-      <w:tr>
-        <w:tblPrEx>
-          <w:tblCellMar>
-            <w:top w:w="0" w:type="dxa"/>
-            <w:bottom w:w="0" w:type="dxa"/>
-          </w:tblCellMar>
-        </w:tblPrEx>
-        <w:trPr>
-          <w:cantSplit/>
-        </w:trPr>
-        <w:tc>
-          <w:tcPr>
-            <w:tcW w:w="900" w:type="dxa"/>
-            <w:vAlign w:val="center"/>
-          </w:tcPr>
-          <w:p>
-            <w:r>
-              <w:t>3b</w:t>
-            </w:r>
-          </w:p>
-        </w:tc>
-        <w:tc>
-          <w:tcPr>
-            <w:tcW w:w="3730" w:type="dxa"/>
-            <w:vAlign w:val="center"/>
-          </w:tcPr>
-          <w:p>
-            <w:r>
-              <w:t>No existe una ruta vehicular posible entre los puntos indicados:</w:t>
-            </w:r>
-          </w:p>
-        </w:tc>
-        <w:tc>
-          <w:tcPr>
-            <w:tcW w:w="4730" w:type="dxa"/>
-            <w:vAlign w:val="center"/>
-          </w:tcPr>
-          <w:p>
-            <w:r>
-              <w:t>1. El sistema notifica que no se encontró una ruta válida.</w:t>
+              <w:t xml:space="preserve">2. Sugiere reintentar más tarde; el cálculo de la ruta no depende de Mapbox.</w:t>
             </w:r>
           </w:p>
         </w:tc>
@@ -5080,7 +5141,7 @@
         <w:spacing w:after="80"/>
       </w:pPr>
       <w:r>
-        <w:t xml:space="preserve">El motor core puede configurarse para usar Dijkstra o A* modificado según el escenario de carga.</w:t>
+        <w:t xml:space="preserve">El motor core usa A* y puede configurarse para usar Dijkstra.</w:t>
       </w:r>
     </w:p>
     <w:p>
@@ -5088,7 +5149,7 @@
         <w:spacing w:after="80"/>
       </w:pPr>
       <w:r>
-        <w:t xml:space="preserve">Los datos viales pueden obtenerse en línea desde Mapbox o desde una caché local ante baja conectividad.</w:t>
+        <w:t xml:space="preserve">La red de calles sale de un extracto de OpenStreetMap de la mancha urbana de Tarija, filtrado a vías vehiculares, que el motor carga en memoria al arrancar; el cálculo no depende de un servicio externo.</w:t>
       </w:r>
     </w:p>
     <w:p>
@@ -5288,7 +5349,7 @@
           </w:tcPr>
           <w:p>
             <w:r>
-              <w:t xml:space="preserve">06/10/2026</w:t>
+              <w:t xml:space="preserve">13/10/2026</w:t>
             </w:r>
           </w:p>
         </w:tc>
@@ -5586,7 +5647,7 @@
           </w:tcPr>
           <w:p>
             <w:r>
-              <w:t>El sistema detecta una zona de congestión sobre el trayecto de una ruta activa.</w:t>
+              <w:t xml:space="preserve">Un evento vial vigente (reportado por un conductor o congestión detectada por telemetría) afecta el tramo que le falta recorrer a una ruta activa.</w:t>
             </w:r>
           </w:p>
         </w:tc>
@@ -5655,7 +5716,7 @@
               </w:numPr>
             </w:pPr>
             <w:r>
-              <w:t xml:space="preserve">El sistema detectó una zona de congestión sobre el trayecto, por reporte de otro usuario o por la telemetría de velocidad y posición.</w:t>
+              <w:t xml:space="preserve">Hay un evento vial vigente sobre el trayecto que falta: un evento reportado por otro conductor o una congestión detectada por la telemetría.</w:t>
             </w:r>
           </w:p>
         </w:tc>
@@ -5700,7 +5761,7 @@
               </w:numPr>
             </w:pPr>
             <w:r>
-              <w:t>Se genera y se muestra al conductor una ruta alternativa que evita la zona congestionada, sin interrumpir la navegación en curso.</w:t>
+              <w:t xml:space="preserve">Si existe una ruta mejor, se propone al conductor sin interrumpir la navegación en curso, y él decide si la acepta.</w:t>
             </w:r>
           </w:p>
         </w:tc>
@@ -5738,7 +5799,7 @@
           </w:tcPr>
           <w:p>
             <w:r>
-              <w:t>Si no existe una ruta alternativa viable, se mantiene la ruta original y se notifica la congestión al conductor.</w:t>
+              <w:t xml:space="preserve">Si no existe una ruta alternativa viable, se mantiene la ruta original y se notifica el evento al conductor.</w:t>
             </w:r>
           </w:p>
         </w:tc>
@@ -5783,7 +5844,7 @@
               </w:numPr>
             </w:pPr>
             <w:r>
-              <w:t xml:space="preserve">Motor core (C++): recalcula la ruta ante congestión.</w:t>
+              <w:t xml:space="preserve">Motor core (núcleo en C++ con una cara en Java): revisa si algún evento afecta lo que falta de la ruta y calcula la alternativa.</w:t>
             </w:r>
           </w:p>
           <w:p>
@@ -5795,7 +5856,7 @@
               </w:numPr>
             </w:pPr>
             <w:r>
-              <w:t xml:space="preserve">Backend Java: provee los eventos de congestión reportados o detectados.</w:t>
+              <w:t xml:space="preserve">Backend Java: recibe la ruta activa desde la app y mantiene al motor al día con los eventos vigentes.</w:t>
             </w:r>
           </w:p>
         </w:tc>
@@ -5833,7 +5894,7 @@
           </w:tcPr>
           <w:p>
             <w:r>
-              <w:t>Ante congestión detectada durante la navegación activa, el sistema recalcula automáticamente una ruta alternativa que evita la zona afectada, sin interrumpir el trayecto del conductor.</w:t>
+              <w:t xml:space="preserve">Cuando un evento vial afecta el camino que falta durante la navegación activa, el sistema calcula una ruta alternativa y, si es mejor, se la propone al conductor sin interrumpir el trayecto; el conductor la acepta o la rechaza.</w:t>
             </w:r>
           </w:p>
         </w:tc>
@@ -5861,7 +5922,7 @@
         </w:rPr>
         <w:drawing>
           <wp:inline distT="0" distB="0" distL="0" distR="0" wp14:anchorId="462C9905" wp14:editId="2599A1DC">
-            <wp:extent cx="4529709" cy="3103245"/>
+            <wp:extent cx="4330827" cy="3103245"/>
             <wp:effectExtent l="0" t="0" r="7620" b="0"/>
             <wp:docPr id="507" name="CU-04_casos_de_uso.png"/>
             <wp:cNvGraphicFramePr>
@@ -5883,7 +5944,7 @@
                   <pic:spPr>
                     <a:xfrm>
                       <a:off x="0" y="0"/>
-                      <a:ext cx="4529709" cy="3103245"/>
+                      <a:ext cx="4330827" cy="3103245"/>
                     </a:xfrm>
                     <a:prstGeom prst="rect">
                       <a:avLst/>
@@ -6038,7 +6099,7 @@
               <w:keepNext/>
             </w:pPr>
             <w:r>
-              <w:t>Llegar a su destino evitando demoras por congestión, sin intervención manual.</w:t>
+              <w:t xml:space="preserve">Llegar a su destino evitando demoras, sin tener que buscar él mismo otra ruta.</w:t>
             </w:r>
           </w:p>
         </w:tc>
@@ -6228,7 +6289,7 @@
           </w:tcPr>
           <w:p>
             <w:r>
-              <w:t>El sistema detecta una zona de congestión en la ruta activa (evento reportado o telemetría anómala) y evalúa su impacto.</w:t>
+              <w:t xml:space="preserve">El sistema detecta un evento vial vigente sobre el tramo que falta de la ruta activa (reportado por un conductor o congestión por telemetría).</w:t>
             </w:r>
           </w:p>
         </w:tc>
@@ -6272,7 +6333,7 @@
           </w:tcPr>
           <w:p>
             <w:r>
-              <w:t xml:space="preserve">El sistema solicita al motor core una ruta alternativa que evite la zona congestionada.</w:t>
+              <w:t xml:space="preserve">El sistema solicita al motor core una ruta alternativa y la compara con la ruta actual.</w:t>
             </w:r>
           </w:p>
         </w:tc>
@@ -6316,7 +6377,7 @@
           </w:tcPr>
           <w:p>
             <w:r>
-              <w:t xml:space="preserve">El motor core recalcula y el sistema muestra la nueva ruta de forma no intrusiva.</w:t>
+              <w:t xml:space="preserve">Si la alternativa es mejor, el sistema la propone de forma no intrusiva, con las opciones de aceptarla o rechazarla.</w:t>
             </w:r>
           </w:p>
         </w:tc>
@@ -6349,7 +6410,7 @@
           </w:tcPr>
           <w:p>
             <w:r>
-              <w:t>El conductor continúa la navegación.</w:t>
+              <w:t xml:space="preserve">El conductor acepta la ruta propuesta.</w:t>
             </w:r>
           </w:p>
         </w:tc>
@@ -6389,7 +6450,7 @@
         </w:rPr>
         <w:drawing>
           <wp:inline distT="0" distB="0" distL="0" distR="0" wp14:anchorId="1F1967FA" wp14:editId="2CB69513">
-            <wp:extent cx="5943600" cy="6568050"/>
+            <wp:extent cx="5943600" cy="6130132"/>
             <wp:effectExtent l="0" t="0" r="0" b="0"/>
             <wp:docPr id="508" name="CU-04_actividad.png"/>
             <wp:cNvGraphicFramePr>
@@ -6411,7 +6472,7 @@
                   <pic:spPr>
                     <a:xfrm>
                       <a:off x="0" y="0"/>
-                      <a:ext cx="5943600" cy="6568050"/>
+                      <a:ext cx="5943600" cy="6130132"/>
                     </a:xfrm>
                     <a:prstGeom prst="rect">
                       <a:avLst/>
@@ -6594,7 +6655,7 @@
           </w:p>
           <w:p>
             <w:r>
-              <w:t>2. Notifica al conductor la congestión detectada.</w:t>
+              <w:t xml:space="preserve">2. Notifica al conductor el evento que afecta su ruta.</w:t>
             </w:r>
           </w:p>
         </w:tc>
@@ -6638,7 +6699,56 @@
           </w:tcPr>
           <w:p>
             <w:r>
-              <w:t>1. El sistema mantiene la ruta original marcada como congestionada.</w:t>
+              <w:t xml:space="preserve">1. El sistema mantiene la ruta original y muestra el evento sobre ella.</w:t>
+            </w:r>
+          </w:p>
+        </w:tc>
+      </w:tr>
+      <w:tr>
+        <w:tblPrEx>
+          <w:tblCellMar>
+            <w:top w:w="0" w:type="dxa"/>
+            <w:bottom w:w="0" w:type="dxa"/>
+          </w:tblCellMar>
+        </w:tblPrEx>
+        <w:trPr>
+          <w:cantSplit/>
+        </w:trPr>
+        <w:tc>
+          <w:tcPr>
+            <w:tcW w:w="900" w:type="dxa"/>
+            <w:vAlign w:val="center"/>
+          </w:tcPr>
+          <w:p>
+            <w:r>
+              <w:t xml:space="preserve">4a</w:t>
+            </w:r>
+          </w:p>
+        </w:tc>
+        <w:tc>
+          <w:tcPr>
+            <w:tcW w:w="3730" w:type="dxa"/>
+            <w:vAlign w:val="center"/>
+          </w:tcPr>
+          <w:p>
+            <w:r>
+              <w:t xml:space="preserve">El conductor no responde a la propuesta en 15 segundos:</w:t>
+            </w:r>
+          </w:p>
+        </w:tc>
+        <w:tc>
+          <w:tcPr>
+            <w:tcW w:w="4730" w:type="dxa"/>
+            <w:vAlign w:val="center"/>
+          </w:tcPr>
+          <w:p>
+            <w:r>
+              <w:t xml:space="preserve">1. El aviso se cierra solo.</w:t>
+            </w:r>
+          </w:p>
+          <w:p>
+            <w:r>
+              <w:t xml:space="preserve">2. Sigue la ruta original y ese evento no vuelve a generar una propuesta en esta ruta.</w:t>
             </w:r>
           </w:p>
         </w:tc>
@@ -6675,7 +6785,7 @@
         <w:spacing w:after="80"/>
       </w:pPr>
       <w:r>
-        <w:t>Seguridad: Evitar recálculos innecesarios o repetitivos que puedan distraer al conductor.</w:t>
+        <w:t xml:space="preserve">Seguridad: Evitar recálculos innecesarios o repetitivos que puedan distraer al conductor; un mismo evento genera una sola propuesta por ruta.</w:t>
       </w:r>
     </w:p>
     <w:p>
@@ -6693,7 +6803,7 @@
         <w:spacing w:after="80"/>
       </w:pPr>
       <w:r>
-        <w:t xml:space="preserve">La congestión puede detectarse por reportes colaborativos (CU-01) o por la telemetría de velocidad y posición que la app envía mientras está abierta en pantalla, con o sin ruta activa (HU-13). La app no obtiene la ubicación en segundo plano.</w:t>
+        <w:t xml:space="preserve">Los eventos que pueden afectar la ruta son los que reportan los conductores (CU-01) y la congestión que el sistema detecta con la telemetría: la app envía su posición mientras está abierta en pantalla, con o sin ruta activa (HU-13), y el sistema calcula la velocidad. La app no obtiene la ubicación en segundo plano.</w:t>
       </w:r>
     </w:p>
     <w:p>
@@ -6701,7 +6811,7 @@
         <w:spacing w:after="80"/>
       </w:pPr>
       <w:r>
-        <w:t xml:space="preserve">Por telemetría, se considera congestión cuando un vehículo permanece detenido o avanza muy lento en una vía vehicular por más tiempo de un umbral que se definirá durante la Construcción.</w:t>
+        <w:t xml:space="preserve">Por telemetría, se considera congestión cuando un vehículo permanece detenido o avanza muy lento en una vía vehicular durante 2 minutos seguidos por debajo de la mitad de la velocidad esperada del tipo de vía; por debajo de la cuarta parte, la congestión es fuerte (valores iniciales, a ajustar con las pruebas).</w:t>
       </w:r>
     </w:p>
     <w:p>
@@ -6901,7 +7011,7 @@
           </w:tcPr>
           <w:p>
             <w:r>
-              <w:t xml:space="preserve">06/10/2026</w:t>
+              <w:t xml:space="preserve">13/10/2026</w:t>
             </w:r>
           </w:p>
         </w:tc>
@@ -7990,7 +8100,7 @@
         </w:rPr>
         <w:drawing>
           <wp:inline distT="0" distB="0" distL="0" distR="0" wp14:anchorId="6E2095A0" wp14:editId="7318FF60">
-            <wp:extent cx="3762497" cy="7315200"/>
+            <wp:extent cx="3633938" cy="7315200"/>
             <wp:effectExtent l="0" t="0" r="0" b="0"/>
             <wp:docPr id="510" name="CU-05_actividad.png"/>
             <wp:cNvGraphicFramePr>
@@ -8012,7 +8122,7 @@
                   <pic:spPr>
                     <a:xfrm>
                       <a:off x="0" y="0"/>
-                      <a:ext cx="3762497" cy="7315200"/>
+                      <a:ext cx="3633938" cy="7315200"/>
                     </a:xfrm>
                     <a:prstGeom prst="rect">
                       <a:avLst/>
@@ -8212,7 +8322,7 @@
           </w:tcPr>
           <w:p>
             <w:r>
-              <w:t xml:space="preserve">4a</w:t>
+              <w:t xml:space="preserve">*a</w:t>
             </w:r>
           </w:p>
         </w:tc>
@@ -8223,7 +8333,7 @@
           </w:tcPr>
           <w:p>
             <w:r>
-              <w:t xml:space="preserve">La app pregunta "¿Acabas de recargar combustible?" sobre un surtidor y el conductor responde "Sí" (HU-12):</w:t>
+              <w:t xml:space="preserve">En cualquier momento, con la app abierta, el conductor se detiene unos minutos junto a un surtidor del catálogo y la app pregunta "¿Acabas de recargar combustible?" (HU-12):</w:t>
             </w:r>
           </w:p>
         </w:tc>
@@ -8234,12 +8344,12 @@
           </w:tcPr>
           <w:p>
             <w:r>
-              <w:t xml:space="preserve">1. La app le pregunta el tipo de combustible y muestra los tipos definidos (sección 8).</w:t>
-            </w:r>
-          </w:p>
-          <w:p>
-            <w:r>
-              <w:t xml:space="preserve">2. El conductor elige el tipo y el backend marca ese combustible como disponible en el surtidor, con origen "Conductores" y la fecha de la confirmación.</w:t>
+              <w:t xml:space="preserve">1. Si responde "Sí", la app le pregunta el tipo de combustible y muestra los tipos definidos (sección 8).</w:t>
+            </w:r>
+          </w:p>
+          <w:p>
+            <w:r>
+              <w:t xml:space="preserve">2. El conductor elige el tipo; el backend comprueba que la ubicación está junto al surtidor y que no repite una confirmación reciente, y marca ese combustible como disponible en el surtidor, con origen "Conductores" y la fecha de la confirmación.</w:t>
             </w:r>
           </w:p>
           <w:p>
@@ -8308,6 +8418,14 @@
       </w:pPr>
       <w:r>
         <w:t xml:space="preserve">Vigencia del estado de un surtidor (valor inicial, a ajustar con las pruebas): pasadas 6 horas sin un dato nuevo, el surtidor se muestra como "sin información reciente".</w:t>
+      </w:r>
+    </w:p>
+    <w:p>
+      <w:pPr>
+        <w:spacing w:after="80"/>
+      </w:pPr>
+      <w:r>
+        <w:t xml:space="preserve">La pregunta de recarga aparece cuando el conductor lleva 3 minutos detenido a menos de 50 metros de un surtidor, y no se repite para el mismo surtidor y tipo antes de 60 minutos (valores iniciales). Mientras la lista de surtidores está abierta, se actualiza cada 60 segundos, y los surtidores también se muestran como marcadores en el mapa.</w:t>
       </w:r>
     </w:p>
     <w:p>
@@ -8523,7 +8641,7 @@
           </w:tcPr>
           <w:p>
             <w:r>
-              <w:t xml:space="preserve">06/10/2026</w:t>
+              <w:t xml:space="preserve">13/10/2026</w:t>
             </w:r>
           </w:p>
         </w:tc>
@@ -9375,7 +9493,7 @@
           </w:tcPr>
           <w:p>
             <w:r>
-              <w:t>Que no se almacenen sus datos personales (número o nombre) y que el texto de sus mensajes no se conserve después del análisis.</w:t>
+              <w:t xml:space="preserve">Que no se almacenen sus datos personales (número o nombre) y que el sistema no conserve el texto de sus mensajes después del análisis.</w:t>
             </w:r>
           </w:p>
         </w:tc>
@@ -9778,7 +9896,7 @@
         </w:rPr>
         <w:drawing>
           <wp:inline distT="0" distB="0" distL="0" distR="0" wp14:anchorId="379F3C43" wp14:editId="72D7A7EF">
-            <wp:extent cx="4774634" cy="7315200"/>
+            <wp:extent cx="5418534" cy="7315200"/>
             <wp:effectExtent l="0" t="0" r="0" b="0"/>
             <wp:docPr id="512" name="CU-06_actividad.png"/>
             <wp:cNvGraphicFramePr>
@@ -9800,7 +9918,7 @@
                   <pic:spPr>
                     <a:xfrm>
                       <a:off x="0" y="0"/>
-                      <a:ext cx="4774634" cy="7315200"/>
+                      <a:ext cx="5418534" cy="7315200"/>
                     </a:xfrm>
                     <a:prstGeom prst="rect">
                       <a:avLst/>
@@ -10188,6 +10306,55 @@
           </w:p>
         </w:tc>
       </w:tr>
+      <w:tr>
+        <w:tblPrEx>
+          <w:tblCellMar>
+            <w:top w:w="0" w:type="dxa"/>
+            <w:bottom w:w="0" w:type="dxa"/>
+          </w:tblCellMar>
+        </w:tblPrEx>
+        <w:trPr>
+          <w:cantSplit/>
+        </w:trPr>
+        <w:tc>
+          <w:tcPr>
+            <w:tcW w:w="900" w:type="dxa"/>
+            <w:vAlign w:val="center"/>
+          </w:tcPr>
+          <w:p>
+            <w:r>
+              <w:t xml:space="preserve">4b</w:t>
+            </w:r>
+          </w:p>
+        </w:tc>
+        <w:tc>
+          <w:tcPr>
+            <w:tcW w:w="3730" w:type="dxa"/>
+            <w:vAlign w:val="center"/>
+          </w:tcPr>
+          <w:p>
+            <w:r>
+              <w:t xml:space="preserve">El backend no recibe el resultado del análisis:</w:t>
+            </w:r>
+          </w:p>
+        </w:tc>
+        <w:tc>
+          <w:tcPr>
+            <w:tcW w:w="4730" w:type="dxa"/>
+            <w:vAlign w:val="center"/>
+          </w:tcPr>
+          <w:p>
+            <w:r>
+              <w:t xml:space="preserve">1. El servicio guarda el resultado, ya sin el texto de los mensajes.</w:t>
+            </w:r>
+          </w:p>
+          <w:p>
+            <w:r>
+              <w:t xml:space="preserve">2. Lo reenvía en el siguiente ciclo.</w:t>
+            </w:r>
+          </w:p>
+        </w:tc>
+      </w:tr>
     </w:tbl>
     <w:p>
       <w:pPr>
@@ -10228,7 +10395,7 @@
         <w:spacing w:after="80"/>
       </w:pPr>
       <w:r>
-        <w:t>Privacidad: No se almacenan números de teléfono ni nombres de los remitentes. El texto de los mensajes se guarda solo de forma temporal y se elimina después de su análisis o al superar el tiempo máximo de vigencia. Al LLM se envían únicamente el texto y la fecha de cada mensaje, y el proveedor elegido no debe usar los datos enviados por API para entrenar sus modelos.</w:t>
+        <w:t xml:space="preserve">Privacidad: No se almacenan números de teléfono ni nombres de los remitentes. El texto de los mensajes se guarda solo de forma temporal y se elimina después de su análisis o al superar el tiempo máximo de vigencia. Al LLM se envían únicamente el texto y la fecha de cada mensaje, con los números de teléfono ocultos. Se usa la capa gratuita de la API de Gemini, cuyos términos permiten a Google usar lo enviado para mejorar sus productos; la política de privacidad lo informa.</w:t>
       </w:r>
     </w:p>
     <w:p>
@@ -10270,7 +10437,7 @@
         <w:spacing w:after="80"/>
       </w:pPr>
       <w:r>
-        <w:t xml:space="preserve">La justificación de estas elecciones y las alternativas descartadas se documentan en la decisión de arquitectura decision_conexion_whatsapp.md (v1.3).</w:t>
+        <w:t xml:space="preserve">La justificación de estas elecciones y las alternativas descartadas se documentan en la decisión de arquitectura decision_conexion_whatsapp.md (v1.4).</w:t>
       </w:r>
     </w:p>
     <w:p>
@@ -12092,7 +12259,7 @@
           </w:tcPr>
           <w:p>
             <w:r>
-              <w:t xml:space="preserve">06/10/2026</w:t>
+              <w:t xml:space="preserve">13/10/2026</w:t>
             </w:r>
           </w:p>
         </w:tc>
@@ -12492,7 +12659,7 @@
               </w:numPr>
             </w:pPr>
             <w:r>
-              <w:t>El conductor obtiene un token de acceso (JWT) propio del sistema, con expiración, emitido tras validar su sesión de Google, habilitado para operaciones autenticadas en el resto de los módulos.</w:t>
+              <w:t xml:space="preserve">El conductor obtiene un token de acceso (JWT) propio del sistema, que dura una hora, y un token de renovación que permite renovarlo durante 30 días sin volver a pasar por Google; con ellos opera en el resto de los módulos.</w:t>
             </w:r>
           </w:p>
         </w:tc>
@@ -13152,7 +13319,7 @@
           </w:tcPr>
           <w:p>
             <w:r>
-              <w:t xml:space="preserve">El backend genera un token JWT propio con expiración.</w:t>
+              <w:t xml:space="preserve">El backend genera un token JWT propio con expiración y un token de renovación.</w:t>
             </w:r>
           </w:p>
         </w:tc>
@@ -13196,7 +13363,7 @@
           </w:tcPr>
           <w:p>
             <w:r>
-              <w:t>El sistema almacena el token de forma segura y redirige al conductor a la pantalla principal (mapa), quedando autenticado.</w:t>
+              <w:t xml:space="preserve">El sistema almacena los tokens de forma segura y redirige al conductor a la pantalla principal (mapa), quedando autenticado.</w:t>
             </w:r>
           </w:p>
         </w:tc>
@@ -13225,7 +13392,7 @@
         </w:rPr>
         <w:drawing>
           <wp:inline distT="0" distB="0" distL="0" distR="0" wp14:anchorId="094385A4" wp14:editId="5C31B895">
-            <wp:extent cx="5943600" cy="5287279"/>
+            <wp:extent cx="5943600" cy="6866795"/>
             <wp:effectExtent l="0" t="0" r="635" b="0"/>
             <wp:docPr id="516" name="CU-08_actividad.png"/>
             <wp:cNvGraphicFramePr>
@@ -13247,7 +13414,7 @@
                   <pic:spPr>
                     <a:xfrm>
                       <a:off x="0" y="0"/>
-                      <a:ext cx="5943600" cy="5287279"/>
+                      <a:ext cx="5943600" cy="6866795"/>
                     </a:xfrm>
                     <a:prstGeom prst="rect">
                       <a:avLst/>
@@ -13533,6 +13700,55 @@
           </w:p>
         </w:tc>
       </w:tr>
+      <w:tr>
+        <w:tblPrEx>
+          <w:tblCellMar>
+            <w:top w:w="0" w:type="dxa"/>
+            <w:bottom w:w="0" w:type="dxa"/>
+          </w:tblCellMar>
+        </w:tblPrEx>
+        <w:trPr>
+          <w:cantSplit/>
+        </w:trPr>
+        <w:tc>
+          <w:tcPr>
+            <w:tcW w:w="900" w:type="dxa"/>
+            <w:vAlign w:val="center"/>
+          </w:tcPr>
+          <w:p>
+            <w:r>
+              <w:t xml:space="preserve">*a</w:t>
+            </w:r>
+          </w:p>
+        </w:tc>
+        <w:tc>
+          <w:tcPr>
+            <w:tcW w:w="3730" w:type="dxa"/>
+            <w:vAlign w:val="center"/>
+          </w:tcPr>
+          <w:p>
+            <w:r>
+              <w:t xml:space="preserve">Con la sesión iniciada, el conductor toca «Cerrar sesión» en el menú de la cuenta:</w:t>
+            </w:r>
+          </w:p>
+        </w:tc>
+        <w:tc>
+          <w:tcPr>
+            <w:tcW w:w="4730" w:type="dxa"/>
+            <w:vAlign w:val="center"/>
+          </w:tcPr>
+          <w:p>
+            <w:r>
+              <w:t xml:space="preserve">1. El backend invalida el token de renovación.</w:t>
+            </w:r>
+          </w:p>
+          <w:p>
+            <w:r>
+              <w:t xml:space="preserve">2. La app borra del teléfono los tokens, la cola de reportes y los datos guardados, y vuelve a la pantalla de inicio de sesión.</w:t>
+            </w:r>
+          </w:p>
+        </w:tc>
+      </w:tr>
     </w:tbl>
     <w:p>
       <w:pPr>
@@ -13591,7 +13807,7 @@
         <w:spacing w:after="80"/>
       </w:pPr>
       <w:r>
-        <w:t xml:space="preserve">La sesión es obligatoria para usar la app: es precondición de CU-01 a CU-05. Si el dispositivo guarda una sesión vigente, la app entra directo al mapa sin repetir este caso de uso, incluso sin conexión a internet.</w:t>
+        <w:t xml:space="preserve">La sesión es obligatoria para usar la app: es precondición de CU-01 a CU-05. Si el dispositivo guarda un token de renovación vigente (30 días), la app entra directo al mapa sin repetir este caso de uso, incluso sin conexión a internet y con el JWT vencido; al volver la conexión, renueva el JWT sin intervención del conductor.</w:t>
       </w:r>
     </w:p>
     <w:p>

</xml_diff>

<commit_message>
docs: incorporar la API de ANH como fuente complementaria de combustible (T-116)
Refs #106
</commit_message>
<xml_diff>
--- a/02_req/editablesWORD/ChuroViaje_Casos_de_Uso.docx
+++ b/02_req/editablesWORD/ChuroViaje_Casos_de_Uso.docx
@@ -7011,7 +7011,7 @@
           </w:tcPr>
           <w:p>
             <w:r>
-              <w:t xml:space="preserve">13/10/2026</w:t>
+              <w:t>23/10/2026</w:t>
             </w:r>
           </w:p>
         </w:tc>
@@ -7423,7 +7423,7 @@
               </w:numPr>
             </w:pPr>
             <w:r>
-              <w:t xml:space="preserve">Se muestra el estado (disponible/agotado) de los surtidores cercanos por tipo de combustible, indicando si el dato proviene del monitoreo de grupos de WhatsApp o de la confirmación de conductores.</w:t>
+              <w:t>Se muestra el estado (disponible/agotado) de los surtidores cercanos por tipo de combustible, indicando si el dato proviene del monitoreo de grupos de WhatsApp, de la consulta a ANH o de la confirmación de conductores; si es de ANH, también su saldo en litros y su estado.</w:t>
             </w:r>
           </w:p>
         </w:tc>
@@ -7506,7 +7506,7 @@
               </w:numPr>
             </w:pPr>
             <w:r>
-              <w:t xml:space="preserve">Backend Java: agrega y expone el estado de los surtidores obtenido del monitoreo de grupos de WhatsApp (CU-06) y de las confirmaciones de los conductores.</w:t>
+              <w:t>Backend Java: agrega y expone el estado de los surtidores obtenido del monitoreo de grupos de WhatsApp (CU-06), de la consulta a ANH (CU-09) y de las confirmaciones de los conductores.</w:t>
             </w:r>
           </w:p>
         </w:tc>
@@ -7544,7 +7544,7 @@
           </w:tcPr>
           <w:p>
             <w:r>
-              <w:t xml:space="preserve">Permite al conductor consultar el estado de disponibilidad de combustible en surtidores cercanos, a partir de la información obtenida del monitoreo de grupos de WhatsApp y de las confirmaciones opcionales de otros conductores.</w:t>
+              <w:t>Permite al conductor consultar el estado de disponibilidad de combustible en surtidores cercanos, a partir de la información obtenida del monitoreo de grupos de WhatsApp, de la API de ANH y de las confirmaciones opcionales de otros conductores.</w:t>
             </w:r>
           </w:p>
         </w:tc>
@@ -7572,7 +7572,7 @@
         </w:rPr>
         <w:drawing>
           <wp:inline distT="0" distB="0" distL="0" distR="0" wp14:anchorId="7381B6AB" wp14:editId="367D40D1">
-            <wp:extent cx="4725162" cy="1999107"/>
+            <wp:extent cx="4725092" cy="2101629"/>
             <wp:effectExtent l="0" t="0" r="0" b="3810"/>
             <wp:docPr id="509" name="CU-05_casos_de_uso.png"/>
             <wp:cNvGraphicFramePr>
@@ -7594,7 +7594,7 @@
                   <pic:spPr>
                     <a:xfrm>
                       <a:off x="0" y="0"/>
-                      <a:ext cx="4725162" cy="1999107"/>
+                      <a:ext cx="4725092" cy="2101629"/>
                     </a:xfrm>
                     <a:prstGeom prst="rect">
                       <a:avLst/>
@@ -7785,7 +7785,7 @@
           </w:tcPr>
           <w:p>
             <w:r>
-              <w:t xml:space="preserve">Garantizar la calidad y confiabilidad del dato mostrado, sea de WhatsApp o de conductores.</w:t>
+              <w:t>Garantizar la calidad y confiabilidad del dato mostrado, sea de WhatsApp, de ANH o de conductores.</w:t>
             </w:r>
           </w:p>
         </w:tc>
@@ -8027,7 +8027,7 @@
           </w:tcPr>
           <w:p>
             <w:r>
-              <w:t xml:space="preserve">El backend responde con el dato más reciente de cada surtidor y tipo de combustible, sea del monitoreo de WhatsApp (CU-06) o de la confirmación de conductores.</w:t>
+              <w:t>El backend responde con el dato más reciente de cada surtidor y tipo de combustible, sea del monitoreo de WhatsApp (CU-06), de la consulta a ANH (CU-09) o de la confirmación de conductores.</w:t>
             </w:r>
           </w:p>
         </w:tc>
@@ -8071,7 +8071,7 @@
           </w:tcPr>
           <w:p>
             <w:r>
-              <w:t xml:space="preserve">El sistema muestra los surtidores con su estado por tipo de combustible, la fila aproximada si se informó, el origen del dato y su fecha de actualización.</w:t>
+              <w:t>El sistema muestra los surtidores con su estado por tipo de combustible, la fila aproximada si se informó, el origen del dato y su fecha de actualización; si el origen es ANH, también su saldo en litros y su estado (alto, medio o bajo).</w:t>
             </w:r>
           </w:p>
         </w:tc>
@@ -8100,7 +8100,7 @@
         </w:rPr>
         <w:drawing>
           <wp:inline distT="0" distB="0" distL="0" distR="0" wp14:anchorId="6E2095A0" wp14:editId="7318FF60">
-            <wp:extent cx="3633938" cy="7315200"/>
+            <wp:extent cx="3753647" cy="7315199"/>
             <wp:effectExtent l="0" t="0" r="0" b="0"/>
             <wp:docPr id="510" name="CU-05_actividad.png"/>
             <wp:cNvGraphicFramePr>
@@ -8122,7 +8122,7 @@
                   <pic:spPr>
                     <a:xfrm>
                       <a:off x="0" y="0"/>
-                      <a:ext cx="3633938" cy="7315200"/>
+                      <a:ext cx="3753647" cy="7315199"/>
                     </a:xfrm>
                     <a:prstGeom prst="rect">
                       <a:avLst/>
@@ -8383,7 +8383,7 @@
         <w:spacing w:after="80"/>
       </w:pPr>
       <w:r>
-        <w:t xml:space="preserve">Usabilidad: Debe distinguirse claramente el origen del dato (WhatsApp o Conductores) en la interfaz.</w:t>
+        <w:t>Usabilidad: Debe distinguirse claramente el origen del dato (WhatsApp, Conductores o ANH) en la interfaz.</w:t>
       </w:r>
     </w:p>
     <w:p>
@@ -8409,7 +8409,7 @@
         <w:spacing w:after="80"/>
       </w:pPr>
       <w:r>
-        <w:t xml:space="preserve">El origen del dato puede ser el monitoreo de los grupos de WhatsApp (CU-06) o la confirmación de un conductor que acaba de recargar (HU-12); para cada tipo de combustible se muestra el más reciente.</w:t>
+        <w:t>El origen del dato puede ser el monitoreo de los grupos de WhatsApp (CU-06), la consulta a ANH (CU-09) o la confirmación de un conductor que acaba de recargar (HU-12); para cada tipo de combustible se muestra el más reciente según la fecha del dato. Si el origen es ANH, se muestran además el saldo en litros y el estado que informa ANH, tal como llegan.</w:t>
       </w:r>
     </w:p>
     <w:p>
@@ -8417,7 +8417,7 @@
         <w:spacing w:after="80"/>
       </w:pPr>
       <w:r>
-        <w:t xml:space="preserve">Vigencia del estado de un surtidor (valor inicial, a ajustar con las pruebas): pasadas 6 horas sin un dato nuevo, el surtidor se muestra como "sin información reciente".</w:t>
+        <w:t>Vigencia del estado de un surtidor (valor inicial, a ajustar con las pruebas): pasadas 6 horas sin un dato nuevo, el surtidor se muestra como "sin información reciente". En WhatsApp y Conductores las horas se cuentan desde la fecha del dato; en ANH, desde la última vez que el backend lo leyó (CU-09).</w:t>
       </w:r>
     </w:p>
     <w:p>
@@ -8441,7 +8441,7 @@
         <w:spacing w:after="80"/>
       </w:pPr>
       <w:r>
-        <w:t xml:space="preserve">Si en el futuro los surtidores otorgan acceso a una API oficial, esta pasaría a ser la fuente primaria y las demás quedarían como respaldo.</w:t>
+        <w:t>Ningún origen reemplaza a otro: WhatsApp y ANH son fuentes automáticas que se complementan con las confirmaciones de los conductores, y si una falla, las demás siguen funcionando.</w:t>
       </w:r>
     </w:p>
     <w:p>
@@ -8641,7 +8641,7 @@
           </w:tcPr>
           <w:p>
             <w:r>
-              <w:t xml:space="preserve">13/10/2026</w:t>
+              <w:t>23/10/2026</w:t>
             </w:r>
           </w:p>
         </w:tc>
@@ -9210,7 +9210,7 @@
           </w:tcPr>
           <w:p>
             <w:r>
-              <w:t xml:space="preserve">Permite que el sistema, de forma automática, extraiga los mensajes compartidos en los grupos de WhatsApp monitoreados y los interprete por lotes mediante un LLM para actualizar el estado de disponibilidad de los surtidores, sin depender de reportes de los conductores.</w:t>
+              <w:t>Permite que el sistema, de forma automática, extraiga los mensajes compartidos en los grupos de WhatsApp monitoreados y los interprete por lotes mediante un LLM para actualizar el estado de disponibilidad de los surtidores, sin depender de reportes de los conductores. Es una de las dos fuentes automáticas del estado de los surtidores; la otra es la consulta a ANH (CU-09).</w:t>
             </w:r>
           </w:p>
         </w:tc>
@@ -9239,7 +9239,7 @@
         </w:rPr>
         <w:drawing>
           <wp:inline distT="0" distB="0" distL="0" distR="0" wp14:anchorId="210A0794" wp14:editId="18D17C6E">
-            <wp:extent cx="5943600" cy="2132000"/>
+            <wp:extent cx="5943600" cy="2293543"/>
             <wp:effectExtent l="0" t="0" r="0" b="0"/>
             <wp:docPr id="511" name="CU-06_casos_de_uso.png"/>
             <wp:cNvGraphicFramePr>
@@ -9261,7 +9261,7 @@
                   <pic:spPr>
                     <a:xfrm>
                       <a:off x="0" y="0"/>
-                      <a:ext cx="5943600" cy="2132000"/>
+                      <a:ext cx="5943600" cy="2293543"/>
                     </a:xfrm>
                     <a:prstGeom prst="rect">
                       <a:avLst/>
@@ -10445,7 +10445,7 @@
         <w:spacing w:after="80"/>
       </w:pPr>
       <w:r>
-        <w:t>Si en el futuro se consigue acceso a una API externa oficial de los surtidores, esta pasa a ser la fuente primaria y el monitoreo de WhatsApp queda como respaldo.</w:t>
+        <w:t>Ningún origen reemplaza a otro: la consulta a ANH (CU-09) es una segunda fuente automática que se complementa con este monitoreo, y si una falla, la otra sigue funcionando.</w:t>
       </w:r>
     </w:p>
     <w:p>
@@ -13816,6 +13816,2108 @@
       </w:pPr>
       <w:r>
         <w:t xml:space="preserve">A futuro podría incorporarse un proveedor adicional (p. ej. Apple Sign-In) sin cambiar el contrato del caso de uso.</w:t>
+      </w:r>
+    </w:p>
+    <w:p>
+      <w:pPr>
+        <w:pageBreakBefore/>
+        <w:jc w:val="center"/>
+      </w:pPr>
+      <w:r>
+        <w:rPr>
+          <w:b/>
+          <w:bCs/>
+          <w:sz w:val="28"/>
+          <w:szCs w:val="28"/>
+        </w:rPr>
+        <w:lastRenderedPageBreak/>
+        <w:t>ESPECIFICACIÓN DE CASO DE USO</w:t>
+      </w:r>
+    </w:p>
+    <w:p>
+      <w:pPr>
+        <w:spacing w:after="200"/>
+        <w:jc w:val="center"/>
+      </w:pPr>
+      <w:r>
+        <w:rPr>
+          <w:i/>
+          <w:iCs/>
+        </w:rPr>
+        <w:t xml:space="preserve">Formato Estructurado 'Fully Dressed' - Alistair Cockburn</w:t>
+      </w:r>
+    </w:p>
+    <w:tbl>
+      <w:tblPr>
+        <w:tblW w:w="9360" w:type="dxa"/>
+        <w:tblBorders>
+          <w:top w:val="single" w:sz="4" w:space="0" w:color="auto"/>
+          <w:left w:val="single" w:sz="4" w:space="0" w:color="auto"/>
+          <w:bottom w:val="single" w:sz="4" w:space="0" w:color="auto"/>
+          <w:right w:val="single" w:sz="4" w:space="0" w:color="auto"/>
+          <w:insideH w:val="single" w:sz="4" w:space="0" w:color="auto"/>
+          <w:insideV w:val="single" w:sz="4" w:space="0" w:color="auto"/>
+        </w:tblBorders>
+        <w:tblCellMar>
+          <w:left w:w="10" w:type="dxa"/>
+          <w:right w:w="10" w:type="dxa"/>
+        </w:tblCellMar>
+        <w:tblLook w:val="04A0" w:firstRow="1" w:lastRow="0" w:firstColumn="1" w:lastColumn="0" w:noHBand="0" w:noVBand="1"/>
+      </w:tblPr>
+      <w:tblGrid>
+        <w:gridCol w:w="2600"/>
+        <w:gridCol w:w="6760"/>
+      </w:tblGrid>
+      <w:tr>
+        <w:tblPrEx>
+          <w:tblCellMar>
+            <w:top w:w="0" w:type="dxa"/>
+            <w:bottom w:w="0" w:type="dxa"/>
+          </w:tblCellMar>
+        </w:tblPrEx>
+        <w:trPr>
+          <w:cantSplit/>
+        </w:trPr>
+        <w:tc>
+          <w:tcPr>
+            <w:tcW w:w="2600" w:type="dxa"/>
+            <w:shd w:val="clear" w:color="auto" w:fill="D9D9D9"/>
+            <w:vAlign w:val="center"/>
+          </w:tcPr>
+          <w:p>
+            <w:r>
+              <w:rPr>
+                <w:b/>
+                <w:bCs/>
+              </w:rPr>
+              <w:t>Código de Caso de Uso:</w:t>
+            </w:r>
+          </w:p>
+        </w:tc>
+        <w:tc>
+          <w:tcPr>
+            <w:tcW w:w="6760" w:type="dxa"/>
+            <w:vAlign w:val="center"/>
+          </w:tcPr>
+          <w:p>
+            <w:r>
+              <w:t>CU-09</w:t>
+            </w:r>
+          </w:p>
+        </w:tc>
+      </w:tr>
+      <w:tr>
+        <w:tblPrEx>
+          <w:tblCellMar>
+            <w:top w:w="0" w:type="dxa"/>
+            <w:bottom w:w="0" w:type="dxa"/>
+          </w:tblCellMar>
+        </w:tblPrEx>
+        <w:trPr>
+          <w:cantSplit/>
+        </w:trPr>
+        <w:tc>
+          <w:tcPr>
+            <w:tcW w:w="2600" w:type="dxa"/>
+            <w:shd w:val="clear" w:color="auto" w:fill="D9D9D9"/>
+            <w:vAlign w:val="center"/>
+          </w:tcPr>
+          <w:p>
+            <w:r>
+              <w:rPr>
+                <w:b/>
+                <w:bCs/>
+              </w:rPr>
+              <w:t>Nombre del Caso de Uso:</w:t>
+            </w:r>
+          </w:p>
+        </w:tc>
+        <w:tc>
+          <w:tcPr>
+            <w:tcW w:w="6760" w:type="dxa"/>
+            <w:vAlign w:val="center"/>
+          </w:tcPr>
+          <w:p>
+            <w:r>
+              <w:t>Consultar Estado de Combustible desde ANH</w:t>
+            </w:r>
+          </w:p>
+        </w:tc>
+      </w:tr>
+      <w:tr>
+        <w:tblPrEx>
+          <w:tblCellMar>
+            <w:top w:w="0" w:type="dxa"/>
+            <w:bottom w:w="0" w:type="dxa"/>
+          </w:tblCellMar>
+        </w:tblPrEx>
+        <w:trPr>
+          <w:cantSplit/>
+        </w:trPr>
+        <w:tc>
+          <w:tcPr>
+            <w:tcW w:w="2600" w:type="dxa"/>
+            <w:shd w:val="clear" w:color="auto" w:fill="D9D9D9"/>
+            <w:vAlign w:val="center"/>
+          </w:tcPr>
+          <w:p>
+            <w:r>
+              <w:rPr>
+                <w:b/>
+                <w:bCs/>
+              </w:rPr>
+              <w:t>Proyecto / Sistema:</w:t>
+            </w:r>
+          </w:p>
+        </w:tc>
+        <w:tc>
+          <w:tcPr>
+            <w:tcW w:w="6760" w:type="dxa"/>
+            <w:vAlign w:val="center"/>
+          </w:tcPr>
+          <w:p>
+            <w:r>
+              <w:t>ChuroViaje</w:t>
+            </w:r>
+          </w:p>
+        </w:tc>
+      </w:tr>
+      <w:tr>
+        <w:tblPrEx>
+          <w:tblCellMar>
+            <w:top w:w="0" w:type="dxa"/>
+            <w:bottom w:w="0" w:type="dxa"/>
+          </w:tblCellMar>
+        </w:tblPrEx>
+        <w:trPr>
+          <w:cantSplit/>
+        </w:trPr>
+        <w:tc>
+          <w:tcPr>
+            <w:tcW w:w="2600" w:type="dxa"/>
+            <w:shd w:val="clear" w:color="auto" w:fill="D9D9D9"/>
+            <w:vAlign w:val="center"/>
+          </w:tcPr>
+          <w:p>
+            <w:r>
+              <w:rPr>
+                <w:b/>
+                <w:bCs/>
+              </w:rPr>
+              <w:t>Fecha de Versión:</w:t>
+            </w:r>
+          </w:p>
+        </w:tc>
+        <w:tc>
+          <w:tcPr>
+            <w:tcW w:w="6760" w:type="dxa"/>
+            <w:vAlign w:val="center"/>
+          </w:tcPr>
+          <w:p>
+            <w:r>
+              <w:t>23/10/2026</w:t>
+            </w:r>
+          </w:p>
+        </w:tc>
+      </w:tr>
+      <w:tr>
+        <w:tblPrEx>
+          <w:tblCellMar>
+            <w:top w:w="0" w:type="dxa"/>
+            <w:bottom w:w="0" w:type="dxa"/>
+          </w:tblCellMar>
+        </w:tblPrEx>
+        <w:trPr>
+          <w:cantSplit/>
+        </w:trPr>
+        <w:tc>
+          <w:tcPr>
+            <w:tcW w:w="2600" w:type="dxa"/>
+            <w:shd w:val="clear" w:color="auto" w:fill="D9D9D9"/>
+            <w:vAlign w:val="center"/>
+          </w:tcPr>
+          <w:p>
+            <w:r>
+              <w:rPr>
+                <w:b/>
+                <w:bCs/>
+              </w:rPr>
+              <w:t>Autor del Artefacto:</w:t>
+            </w:r>
+          </w:p>
+        </w:tc>
+        <w:tc>
+          <w:tcPr>
+            <w:tcW w:w="6760" w:type="dxa"/>
+            <w:vAlign w:val="center"/>
+          </w:tcPr>
+          <w:p>
+            <w:r>
+              <w:t>Equipo ChuroViaje</w:t>
+            </w:r>
+          </w:p>
+        </w:tc>
+      </w:tr>
+      <w:tr>
+        <w:tblPrEx>
+          <w:tblCellMar>
+            <w:top w:w="0" w:type="dxa"/>
+            <w:bottom w:w="0" w:type="dxa"/>
+          </w:tblCellMar>
+        </w:tblPrEx>
+        <w:trPr>
+          <w:cantSplit/>
+        </w:trPr>
+        <w:tc>
+          <w:tcPr>
+            <w:tcW w:w="2600" w:type="dxa"/>
+            <w:shd w:val="clear" w:color="auto" w:fill="D9D9D9"/>
+            <w:vAlign w:val="center"/>
+          </w:tcPr>
+          <w:p>
+            <w:r>
+              <w:rPr>
+                <w:b/>
+                <w:bCs/>
+              </w:rPr>
+              <w:t>Estado de Aprobación:</w:t>
+            </w:r>
+          </w:p>
+        </w:tc>
+        <w:tc>
+          <w:tcPr>
+            <w:tcW w:w="6760" w:type="dxa"/>
+            <w:vAlign w:val="center"/>
+          </w:tcPr>
+          <w:p>
+            <w:r>
+              <w:t>Aprobado</w:t>
+            </w:r>
+          </w:p>
+        </w:tc>
+      </w:tr>
+    </w:tbl>
+    <w:p>
+      <w:pPr>
+        <w:pStyle w:val="Ttulo1"/>
+        <w:keepNext/>
+        <w:spacing w:before="300" w:after="150"/>
+      </w:pPr>
+      <w:r>
+        <w:t>1. Ficha del Caso de Uso (¿Quién? ¿Qué? ¿Cuándo?)</w:t>
+      </w:r>
+    </w:p>
+    <w:tbl>
+      <w:tblPr>
+        <w:tblW w:w="9360" w:type="dxa"/>
+        <w:tblBorders>
+          <w:top w:val="single" w:sz="4" w:space="0" w:color="auto"/>
+          <w:left w:val="single" w:sz="4" w:space="0" w:color="auto"/>
+          <w:bottom w:val="single" w:sz="4" w:space="0" w:color="auto"/>
+          <w:right w:val="single" w:sz="4" w:space="0" w:color="auto"/>
+          <w:insideH w:val="single" w:sz="4" w:space="0" w:color="auto"/>
+          <w:insideV w:val="single" w:sz="4" w:space="0" w:color="auto"/>
+        </w:tblBorders>
+        <w:tblCellMar>
+          <w:left w:w="10" w:type="dxa"/>
+          <w:right w:w="10" w:type="dxa"/>
+        </w:tblCellMar>
+        <w:tblLook w:val="04A0" w:firstRow="1" w:lastRow="0" w:firstColumn="1" w:lastColumn="0" w:noHBand="0" w:noVBand="1"/>
+      </w:tblPr>
+      <w:tblGrid>
+        <w:gridCol w:w="2600"/>
+        <w:gridCol w:w="6760"/>
+      </w:tblGrid>
+      <w:tr>
+        <w:tblPrEx>
+          <w:tblCellMar>
+            <w:top w:w="0" w:type="dxa"/>
+            <w:bottom w:w="0" w:type="dxa"/>
+          </w:tblCellMar>
+        </w:tblPrEx>
+        <w:trPr>
+          <w:cantSplit/>
+        </w:trPr>
+        <w:tc>
+          <w:tcPr>
+            <w:tcW w:w="2600" w:type="dxa"/>
+            <w:shd w:val="clear" w:color="auto" w:fill="D9D9D9"/>
+            <w:vAlign w:val="center"/>
+          </w:tcPr>
+          <w:p>
+            <w:r>
+              <w:rPr>
+                <w:b/>
+                <w:bCs/>
+              </w:rPr>
+              <w:t>Nombre del Caso de Uso:</w:t>
+            </w:r>
+          </w:p>
+        </w:tc>
+        <w:tc>
+          <w:tcPr>
+            <w:tcW w:w="6760" w:type="dxa"/>
+            <w:vAlign w:val="center"/>
+          </w:tcPr>
+          <w:p>
+            <w:r>
+              <w:t>CU-09: Consultar Estado de Combustible desde ANH</w:t>
+            </w:r>
+          </w:p>
+        </w:tc>
+      </w:tr>
+      <w:tr>
+        <w:tblPrEx>
+          <w:tblCellMar>
+            <w:top w:w="0" w:type="dxa"/>
+            <w:bottom w:w="0" w:type="dxa"/>
+          </w:tblCellMar>
+        </w:tblPrEx>
+        <w:trPr>
+          <w:cantSplit/>
+        </w:trPr>
+        <w:tc>
+          <w:tcPr>
+            <w:tcW w:w="2600" w:type="dxa"/>
+            <w:shd w:val="clear" w:color="auto" w:fill="D9D9D9"/>
+            <w:vAlign w:val="center"/>
+          </w:tcPr>
+          <w:p>
+            <w:r>
+              <w:rPr>
+                <w:b/>
+                <w:bCs/>
+              </w:rPr>
+              <w:t>Actor Principal (Quién):</w:t>
+            </w:r>
+          </w:p>
+        </w:tc>
+        <w:tc>
+          <w:tcPr>
+            <w:tcW w:w="6760" w:type="dxa"/>
+            <w:vAlign w:val="center"/>
+          </w:tcPr>
+          <w:p>
+            <w:r>
+              <w:t>Sistema (proceso automático de consulta a ANH)</w:t>
+            </w:r>
+          </w:p>
+        </w:tc>
+      </w:tr>
+      <w:tr>
+        <w:tblPrEx>
+          <w:tblCellMar>
+            <w:top w:w="0" w:type="dxa"/>
+            <w:bottom w:w="0" w:type="dxa"/>
+          </w:tblCellMar>
+        </w:tblPrEx>
+        <w:trPr>
+          <w:cantSplit/>
+        </w:trPr>
+        <w:tc>
+          <w:tcPr>
+            <w:tcW w:w="2600" w:type="dxa"/>
+            <w:shd w:val="clear" w:color="auto" w:fill="D9D9D9"/>
+            <w:vAlign w:val="center"/>
+          </w:tcPr>
+          <w:p>
+            <w:r>
+              <w:rPr>
+                <w:b/>
+                <w:bCs/>
+              </w:rPr>
+              <w:t>Nivel de Abstracción:</w:t>
+            </w:r>
+          </w:p>
+        </w:tc>
+        <w:tc>
+          <w:tcPr>
+            <w:tcW w:w="6760" w:type="dxa"/>
+            <w:vAlign w:val="center"/>
+          </w:tcPr>
+          <w:p>
+            <w:r>
+              <w:t>Subfunction</w:t>
+            </w:r>
+          </w:p>
+        </w:tc>
+      </w:tr>
+      <w:tr>
+        <w:tblPrEx>
+          <w:tblCellMar>
+            <w:top w:w="0" w:type="dxa"/>
+            <w:bottom w:w="0" w:type="dxa"/>
+          </w:tblCellMar>
+        </w:tblPrEx>
+        <w:trPr>
+          <w:cantSplit/>
+        </w:trPr>
+        <w:tc>
+          <w:tcPr>
+            <w:tcW w:w="2600" w:type="dxa"/>
+            <w:shd w:val="clear" w:color="auto" w:fill="D9D9D9"/>
+            <w:vAlign w:val="center"/>
+          </w:tcPr>
+          <w:p>
+            <w:r>
+              <w:rPr>
+                <w:b/>
+                <w:bCs/>
+              </w:rPr>
+              <w:t>Alcance del Sistema:</w:t>
+            </w:r>
+          </w:p>
+        </w:tc>
+        <w:tc>
+          <w:tcPr>
+            <w:tcW w:w="6760" w:type="dxa"/>
+            <w:vAlign w:val="center"/>
+          </w:tcPr>
+          <w:p>
+            <w:r>
+              <w:t>SUD: Backend de ChuroViaje (módulo de combustible)</w:t>
+            </w:r>
+          </w:p>
+        </w:tc>
+      </w:tr>
+      <w:tr>
+        <w:tblPrEx>
+          <w:tblCellMar>
+            <w:top w:w="0" w:type="dxa"/>
+            <w:bottom w:w="0" w:type="dxa"/>
+          </w:tblCellMar>
+        </w:tblPrEx>
+        <w:trPr>
+          <w:cantSplit/>
+        </w:trPr>
+        <w:tc>
+          <w:tcPr>
+            <w:tcW w:w="2600" w:type="dxa"/>
+            <w:shd w:val="clear" w:color="auto" w:fill="D9D9D9"/>
+            <w:vAlign w:val="center"/>
+          </w:tcPr>
+          <w:p>
+            <w:r>
+              <w:rPr>
+                <w:b/>
+                <w:bCs/>
+              </w:rPr>
+              <w:t>Evento Disparador (Trigger):</w:t>
+            </w:r>
+          </w:p>
+        </w:tc>
+        <w:tc>
+          <w:tcPr>
+            <w:tcW w:w="6760" w:type="dxa"/>
+            <w:vAlign w:val="center"/>
+          </w:tcPr>
+          <w:p>
+            <w:r>
+              <w:t>Se cumple el ciclo de consulta del backend (intervalo a definir con las pruebas de la integración).</w:t>
+            </w:r>
+          </w:p>
+        </w:tc>
+      </w:tr>
+      <w:tr>
+        <w:tblPrEx>
+          <w:tblCellMar>
+            <w:top w:w="0" w:type="dxa"/>
+            <w:bottom w:w="0" w:type="dxa"/>
+          </w:tblCellMar>
+        </w:tblPrEx>
+        <w:trPr>
+          <w:cantSplit/>
+        </w:trPr>
+        <w:tc>
+          <w:tcPr>
+            <w:tcW w:w="2600" w:type="dxa"/>
+            <w:shd w:val="clear" w:color="auto" w:fill="D9D9D9"/>
+            <w:vAlign w:val="center"/>
+          </w:tcPr>
+          <w:p>
+            <w:r>
+              <w:rPr>
+                <w:b/>
+                <w:bCs/>
+              </w:rPr>
+              <w:t>Precondiciones (Cuándo):</w:t>
+            </w:r>
+          </w:p>
+        </w:tc>
+        <w:tc>
+          <w:tcPr>
+            <w:tcW w:w="6760" w:type="dxa"/>
+            <w:vAlign w:val="center"/>
+          </w:tcPr>
+          <w:p>
+            <w:pPr>
+              <w:pStyle w:val="Prrafodelista"/>
+              <w:numPr>
+                <w:ilvl w:val="0"/>
+                <w:numId w:val="2"/>
+              </w:numPr>
+            </w:pPr>
+            <w:r>
+              <w:t>El servidor tiene salida HTTPS hacia la API pública de ANH Abastecimiento.</w:t>
+            </w:r>
+          </w:p>
+          <w:p>
+            <w:pPr>
+              <w:pStyle w:val="Prrafodelista"/>
+              <w:numPr>
+                <w:ilvl w:val="0"/>
+                <w:numId w:val="2"/>
+              </w:numPr>
+            </w:pPr>
+            <w:r>
+              <w:t>Existen surtidores en el catálogo vinculados con su estación de ANH.</w:t>
+            </w:r>
+          </w:p>
+        </w:tc>
+      </w:tr>
+      <w:tr>
+        <w:tblPrEx>
+          <w:tblCellMar>
+            <w:top w:w="0" w:type="dxa"/>
+            <w:bottom w:w="0" w:type="dxa"/>
+          </w:tblCellMar>
+        </w:tblPrEx>
+        <w:trPr>
+          <w:cantSplit/>
+        </w:trPr>
+        <w:tc>
+          <w:tcPr>
+            <w:tcW w:w="2600" w:type="dxa"/>
+            <w:shd w:val="clear" w:color="auto" w:fill="D9D9D9"/>
+            <w:vAlign w:val="center"/>
+          </w:tcPr>
+          <w:p>
+            <w:r>
+              <w:rPr>
+                <w:b/>
+                <w:bCs/>
+              </w:rPr>
+              <w:t>Postcondiciones (Éxito):</w:t>
+            </w:r>
+          </w:p>
+        </w:tc>
+        <w:tc>
+          <w:tcPr>
+            <w:tcW w:w="6760" w:type="dxa"/>
+            <w:vAlign w:val="center"/>
+          </w:tcPr>
+          <w:p>
+            <w:pPr>
+              <w:pStyle w:val="Prrafodelista"/>
+              <w:numPr>
+                <w:ilvl w:val="0"/>
+                <w:numId w:val="2"/>
+              </w:numPr>
+            </w:pPr>
+            <w:r>
+              <w:t>El estado de cada surtidor vinculado con una estación de ANH se actualiza con el saldo y el estado que informa ANH, con origen «ANH» y la fecha que informa ANH, y queda disponible para consultas (CU-05).</w:t>
+            </w:r>
+          </w:p>
+          <w:p>
+            <w:pPr>
+              <w:pStyle w:val="Prrafodelista"/>
+              <w:numPr>
+                <w:ilvl w:val="0"/>
+                <w:numId w:val="2"/>
+              </w:numPr>
+            </w:pPr>
+            <w:r>
+              <w:t>No se almacenan datos de personas ni las respuestas completas de ANH.</w:t>
+            </w:r>
+          </w:p>
+        </w:tc>
+      </w:tr>
+      <w:tr>
+        <w:tblPrEx>
+          <w:tblCellMar>
+            <w:top w:w="0" w:type="dxa"/>
+            <w:bottom w:w="0" w:type="dxa"/>
+          </w:tblCellMar>
+        </w:tblPrEx>
+        <w:trPr>
+          <w:cantSplit/>
+        </w:trPr>
+        <w:tc>
+          <w:tcPr>
+            <w:tcW w:w="2600" w:type="dxa"/>
+            <w:shd w:val="clear" w:color="auto" w:fill="D9D9D9"/>
+            <w:vAlign w:val="center"/>
+          </w:tcPr>
+          <w:p>
+            <w:r>
+              <w:rPr>
+                <w:b/>
+                <w:bCs/>
+              </w:rPr>
+              <w:t>Garantía Mínima (Fallo):</w:t>
+            </w:r>
+          </w:p>
+        </w:tc>
+        <w:tc>
+          <w:tcPr>
+            <w:tcW w:w="6760" w:type="dxa"/>
+            <w:vAlign w:val="center"/>
+          </w:tcPr>
+          <w:p>
+            <w:r>
+              <w:t>Si ANH no responde, responde con error o su respuesta no es válida o está incompleta, cada surtidor conserva su último dato con su fecha: un fallo nunca se toma como combustible agotado.</w:t>
+            </w:r>
+          </w:p>
+        </w:tc>
+      </w:tr>
+      <w:tr>
+        <w:tblPrEx>
+          <w:tblCellMar>
+            <w:top w:w="0" w:type="dxa"/>
+            <w:bottom w:w="0" w:type="dxa"/>
+          </w:tblCellMar>
+        </w:tblPrEx>
+        <w:trPr>
+          <w:cantSplit/>
+        </w:trPr>
+        <w:tc>
+          <w:tcPr>
+            <w:tcW w:w="2600" w:type="dxa"/>
+            <w:shd w:val="clear" w:color="auto" w:fill="D9D9D9"/>
+            <w:vAlign w:val="center"/>
+          </w:tcPr>
+          <w:p>
+            <w:r>
+              <w:rPr>
+                <w:b/>
+                <w:bCs/>
+              </w:rPr>
+              <w:t>Actores Secundarios:</w:t>
+            </w:r>
+          </w:p>
+        </w:tc>
+        <w:tc>
+          <w:tcPr>
+            <w:tcW w:w="6760" w:type="dxa"/>
+            <w:vAlign w:val="center"/>
+          </w:tcPr>
+          <w:p>
+            <w:pPr>
+              <w:pStyle w:val="Prrafodelista"/>
+              <w:numPr>
+                <w:ilvl w:val="0"/>
+                <w:numId w:val="2"/>
+              </w:numPr>
+            </w:pPr>
+            <w:r>
+              <w:t>API de ANH Abastecimiento (servicio externo público): informa, por departamento y por combustible, las estaciones con su ubicación, saldo en litros, estado (alto, medio o bajo) y fecha de actualización.</w:t>
+            </w:r>
+          </w:p>
+          <w:p>
+            <w:pPr>
+              <w:pStyle w:val="Prrafodelista"/>
+              <w:numPr>
+                <w:ilvl w:val="0"/>
+                <w:numId w:val="2"/>
+              </w:numPr>
+            </w:pPr>
+            <w:r>
+              <w:t>Backend Java: hace las consultas, valida la respuesta, vincula cada estación con un surtidor del catálogo y actualiza el estado.</w:t>
+            </w:r>
+          </w:p>
+        </w:tc>
+      </w:tr>
+      <w:tr>
+        <w:tblPrEx>
+          <w:tblCellMar>
+            <w:top w:w="0" w:type="dxa"/>
+            <w:bottom w:w="0" w:type="dxa"/>
+          </w:tblCellMar>
+        </w:tblPrEx>
+        <w:trPr>
+          <w:cantSplit/>
+        </w:trPr>
+        <w:tc>
+          <w:tcPr>
+            <w:tcW w:w="2600" w:type="dxa"/>
+            <w:shd w:val="clear" w:color="auto" w:fill="D9D9D9"/>
+            <w:vAlign w:val="center"/>
+          </w:tcPr>
+          <w:p>
+            <w:r>
+              <w:rPr>
+                <w:b/>
+                <w:bCs/>
+              </w:rPr>
+              <w:t>Descripción Breve (Qué/Para qué):</w:t>
+            </w:r>
+          </w:p>
+        </w:tc>
+        <w:tc>
+          <w:tcPr>
+            <w:tcW w:w="6760" w:type="dxa"/>
+            <w:vAlign w:val="center"/>
+          </w:tcPr>
+          <w:p>
+            <w:r>
+              <w:t>Permite que el sistema, de forma automática y periódica, consulte la API pública de ANH Abastecimiento para conocer el saldo y el estado de las estaciones de Tarija y actualizar con ello el estado de los surtidores, como fuente complementaria al monitoreo de WhatsApp (CU-06) y a las confirmaciones de los conductores.</w:t>
+            </w:r>
+          </w:p>
+        </w:tc>
+      </w:tr>
+    </w:tbl>
+    <w:p>
+      <w:pPr>
+        <w:pStyle w:val="Ttulo1"/>
+        <w:keepNext/>
+        <w:spacing w:before="300" w:after="150"/>
+      </w:pPr>
+      <w:r>
+        <w:lastRenderedPageBreak/>
+        <w:t>2. Modelo de Contexto Visual</w:t>
+      </w:r>
+    </w:p>
+    <w:p>
+      <w:pPr>
+        <w:keepNext/>
+        <w:spacing w:before="120" w:after="60"/>
+        <w:jc w:val="center"/>
+      </w:pPr>
+      <w:r>
+        <w:rPr>
+          <w:noProof/>
+        </w:rPr>
+        <w:drawing>
+          <wp:inline distT="0" distB="0" distL="0" distR="0" wp14:anchorId="210A0794" wp14:editId="18D17C6E">
+            <wp:extent cx="5943600" cy="1748117"/>
+            <wp:effectExtent l="0" t="0" r="0" b="0"/>
+            <wp:docPr id="517" name="CU-06_casos_de_uso.png"/>
+            <wp:cNvGraphicFramePr>
+              <a:graphicFrameLocks xmlns:a="http://schemas.openxmlformats.org/drawingml/2006/main" noChangeAspect="1"/>
+            </wp:cNvGraphicFramePr>
+            <a:graphic xmlns:a="http://schemas.openxmlformats.org/drawingml/2006/main">
+              <a:graphicData uri="http://schemas.openxmlformats.org/drawingml/2006/picture">
+                <pic:pic xmlns:pic="http://schemas.openxmlformats.org/drawingml/2006/picture">
+                  <pic:nvPicPr>
+                    <pic:cNvPr id="511" name="CU-06_casos_de_uso.png"/>
+                    <pic:cNvPicPr/>
+                  </pic:nvPicPr>
+                  <pic:blipFill>
+                    <a:blip r:embed="rId23"/>
+                    <a:stretch>
+                      <a:fillRect/>
+                    </a:stretch>
+                  </pic:blipFill>
+                  <pic:spPr>
+                    <a:xfrm>
+                      <a:off x="0" y="0"/>
+                      <a:ext cx="5943600" cy="1748117"/>
+                    </a:xfrm>
+                    <a:prstGeom prst="rect">
+                      <a:avLst/>
+                    </a:prstGeom>
+                  </pic:spPr>
+                </pic:pic>
+              </a:graphicData>
+            </a:graphic>
+          </wp:inline>
+        </w:drawing>
+      </w:r>
+    </w:p>
+    <w:p>
+      <w:pPr>
+        <w:spacing w:after="160"/>
+        <w:jc w:val="center"/>
+      </w:pPr>
+      <w:r>
+        <w:rPr>
+          <w:i/>
+          <w:iCs/>
+          <w:sz w:val="18"/>
+          <w:szCs w:val="18"/>
+        </w:rPr>
+        <w:t>Diagrama de casos de uso de CU-09 (fuente: 03_des/DiagCU/CU-09_ConsultarEstadoANH.puml)</w:t>
+      </w:r>
+    </w:p>
+    <w:p>
+      <w:pPr>
+        <w:pStyle w:val="Ttulo1"/>
+        <w:keepNext/>
+        <w:spacing w:before="300" w:after="150"/>
+      </w:pPr>
+      <w:r>
+        <w:t>3. Partes Interesadas y sus Intereses</w:t>
+      </w:r>
+    </w:p>
+    <w:p>
+      <w:pPr>
+        <w:keepNext/>
+        <w:spacing w:after="150"/>
+      </w:pPr>
+      <w:r>
+        <w:t>Identificación de quiénes se preocupan por este caso de uso y qué garantías exige el negocio:</w:t>
+      </w:r>
+    </w:p>
+    <w:tbl>
+      <w:tblPr>
+        <w:tblW w:w="9360" w:type="dxa"/>
+        <w:tblBorders>
+          <w:top w:val="single" w:sz="4" w:space="0" w:color="auto"/>
+          <w:left w:val="single" w:sz="4" w:space="0" w:color="auto"/>
+          <w:bottom w:val="single" w:sz="4" w:space="0" w:color="auto"/>
+          <w:right w:val="single" w:sz="4" w:space="0" w:color="auto"/>
+          <w:insideH w:val="single" w:sz="4" w:space="0" w:color="auto"/>
+          <w:insideV w:val="single" w:sz="4" w:space="0" w:color="auto"/>
+        </w:tblBorders>
+        <w:tblCellMar>
+          <w:left w:w="10" w:type="dxa"/>
+          <w:right w:w="10" w:type="dxa"/>
+        </w:tblCellMar>
+        <w:tblLook w:val="04A0" w:firstRow="1" w:lastRow="0" w:firstColumn="1" w:lastColumn="0" w:noHBand="0" w:noVBand="1"/>
+      </w:tblPr>
+      <w:tblGrid>
+        <w:gridCol w:w="3120"/>
+        <w:gridCol w:w="6240"/>
+      </w:tblGrid>
+      <w:tr>
+        <w:tblPrEx>
+          <w:tblCellMar>
+            <w:top w:w="0" w:type="dxa"/>
+            <w:bottom w:w="0" w:type="dxa"/>
+          </w:tblCellMar>
+        </w:tblPrEx>
+        <w:trPr>
+          <w:cantSplit/>
+        </w:trPr>
+        <w:tc>
+          <w:tcPr>
+            <w:tcW w:w="3120" w:type="dxa"/>
+            <w:shd w:val="clear" w:color="auto" w:fill="D9D9D9"/>
+            <w:vAlign w:val="center"/>
+          </w:tcPr>
+          <w:p>
+            <w:pPr>
+              <w:keepNext/>
+            </w:pPr>
+            <w:r>
+              <w:rPr>
+                <w:b/>
+                <w:bCs/>
+              </w:rPr>
+              <w:t>Parte Interesada (Stakeholder)</w:t>
+            </w:r>
+          </w:p>
+        </w:tc>
+        <w:tc>
+          <w:tcPr>
+            <w:tcW w:w="6240" w:type="dxa"/>
+            <w:shd w:val="clear" w:color="auto" w:fill="D9D9D9"/>
+            <w:vAlign w:val="center"/>
+          </w:tcPr>
+          <w:p>
+            <w:pPr>
+              <w:keepNext/>
+            </w:pPr>
+            <w:r>
+              <w:rPr>
+                <w:b/>
+                <w:bCs/>
+              </w:rPr>
+              <w:t>Interés en este Caso de Uso (Garantía exigida)</w:t>
+            </w:r>
+          </w:p>
+        </w:tc>
+      </w:tr>
+      <w:tr>
+        <w:tblPrEx>
+          <w:tblCellMar>
+            <w:top w:w="0" w:type="dxa"/>
+            <w:bottom w:w="0" w:type="dxa"/>
+          </w:tblCellMar>
+        </w:tblPrEx>
+        <w:trPr>
+          <w:cantSplit/>
+        </w:trPr>
+        <w:tc>
+          <w:tcPr>
+            <w:tcW w:w="3120" w:type="dxa"/>
+          </w:tcPr>
+          <w:p>
+            <w:pPr>
+              <w:keepNext/>
+            </w:pPr>
+            <w:r>
+              <w:rPr>
+                <w:b/>
+                <w:bCs/>
+              </w:rPr>
+              <w:t>Conductor</w:t>
+            </w:r>
+          </w:p>
+        </w:tc>
+        <w:tc>
+          <w:tcPr>
+            <w:tcW w:w="6240" w:type="dxa"/>
+            <w:vAlign w:val="center"/>
+          </w:tcPr>
+          <w:p>
+            <w:pPr>
+              <w:keepNext/>
+            </w:pPr>
+            <w:r>
+              <w:t>Contar con información de surtidores respaldada por datos públicos, sin tener que reportarla manualmente.</w:t>
+            </w:r>
+          </w:p>
+        </w:tc>
+      </w:tr>
+      <w:tr>
+        <w:tblPrEx>
+          <w:tblCellMar>
+            <w:top w:w="0" w:type="dxa"/>
+            <w:bottom w:w="0" w:type="dxa"/>
+          </w:tblCellMar>
+        </w:tblPrEx>
+        <w:trPr>
+          <w:cantSplit/>
+        </w:trPr>
+        <w:tc>
+          <w:tcPr>
+            <w:tcW w:w="3120" w:type="dxa"/>
+          </w:tcPr>
+          <w:p>
+            <w:pPr>
+              <w:keepNext/>
+            </w:pPr>
+            <w:r>
+              <w:rPr>
+                <w:b/>
+                <w:bCs/>
+              </w:rPr>
+              <w:t>Administrador del sistema</w:t>
+            </w:r>
+          </w:p>
+        </w:tc>
+        <w:tc>
+          <w:tcPr>
+            <w:tcW w:w="6240" w:type="dxa"/>
+            <w:vAlign w:val="center"/>
+          </w:tcPr>
+          <w:p>
+            <w:pPr>
+              <w:keepNext/>
+            </w:pPr>
+            <w:r>
+              <w:t>Que un fallo o un cambio en la respuesta de ANH no dañe los datos: validar la respuesta, conservar el último dato y no tomar un fallo como combustible agotado.</w:t>
+            </w:r>
+          </w:p>
+        </w:tc>
+      </w:tr>
+    </w:tbl>
+    <w:p>
+      <w:pPr>
+        <w:pStyle w:val="Ttulo1"/>
+        <w:keepNext/>
+        <w:spacing w:before="300" w:after="150"/>
+      </w:pPr>
+      <w:r>
+        <w:t>4. Escenario Principal de Éxito (Camino Feliz - Happy Path)</w:t>
+      </w:r>
+    </w:p>
+    <w:p>
+      <w:pPr>
+        <w:keepNext/>
+        <w:spacing w:after="150"/>
+      </w:pPr>
+      <w:r>
+        <w:t>Secuencia paso a paso donde todas las validaciones son exitosas, en estilo de ping-pong (Acción del Actor frente a Reacción del Sistema).</w:t>
+      </w:r>
+    </w:p>
+    <w:tbl>
+      <w:tblPr>
+        <w:tblW w:w="9360" w:type="dxa"/>
+        <w:tblBorders>
+          <w:top w:val="single" w:sz="4" w:space="0" w:color="auto"/>
+          <w:left w:val="single" w:sz="4" w:space="0" w:color="auto"/>
+          <w:bottom w:val="single" w:sz="4" w:space="0" w:color="auto"/>
+          <w:right w:val="single" w:sz="4" w:space="0" w:color="auto"/>
+          <w:insideH w:val="single" w:sz="4" w:space="0" w:color="auto"/>
+          <w:insideV w:val="single" w:sz="4" w:space="0" w:color="auto"/>
+        </w:tblBorders>
+        <w:tblCellMar>
+          <w:left w:w="10" w:type="dxa"/>
+          <w:right w:w="10" w:type="dxa"/>
+        </w:tblCellMar>
+        <w:tblLook w:val="04A0" w:firstRow="1" w:lastRow="0" w:firstColumn="1" w:lastColumn="0" w:noHBand="0" w:noVBand="1"/>
+      </w:tblPr>
+      <w:tblGrid>
+        <w:gridCol w:w="700"/>
+        <w:gridCol w:w="4330"/>
+        <w:gridCol w:w="4330"/>
+      </w:tblGrid>
+      <w:tr>
+        <w:tblPrEx>
+          <w:tblCellMar>
+            <w:top w:w="0" w:type="dxa"/>
+            <w:bottom w:w="0" w:type="dxa"/>
+          </w:tblCellMar>
+        </w:tblPrEx>
+        <w:trPr>
+          <w:cantSplit/>
+        </w:trPr>
+        <w:tc>
+          <w:tcPr>
+            <w:tcW w:w="700" w:type="dxa"/>
+            <w:shd w:val="clear" w:color="auto" w:fill="D9D9D9"/>
+            <w:vAlign w:val="center"/>
+          </w:tcPr>
+          <w:p>
+            <w:pPr>
+              <w:keepNext/>
+            </w:pPr>
+            <w:r>
+              <w:rPr>
+                <w:b/>
+                <w:bCs/>
+              </w:rPr>
+              <w:t>Paso</w:t>
+            </w:r>
+          </w:p>
+        </w:tc>
+        <w:tc>
+          <w:tcPr>
+            <w:tcW w:w="4330" w:type="dxa"/>
+            <w:shd w:val="clear" w:color="auto" w:fill="D9D9D9"/>
+            <w:vAlign w:val="center"/>
+          </w:tcPr>
+          <w:p>
+            <w:pPr>
+              <w:keepNext/>
+            </w:pPr>
+            <w:r>
+              <w:rPr>
+                <w:b/>
+                <w:bCs/>
+              </w:rPr>
+              <w:t>Acción del Actor</w:t>
+            </w:r>
+          </w:p>
+        </w:tc>
+        <w:tc>
+          <w:tcPr>
+            <w:tcW w:w="4330" w:type="dxa"/>
+            <w:shd w:val="clear" w:color="auto" w:fill="D9D9D9"/>
+            <w:vAlign w:val="center"/>
+          </w:tcPr>
+          <w:p>
+            <w:pPr>
+              <w:keepNext/>
+            </w:pPr>
+            <w:r>
+              <w:rPr>
+                <w:b/>
+                <w:bCs/>
+              </w:rPr>
+              <w:t>Respuesta del Sistema</w:t>
+            </w:r>
+          </w:p>
+        </w:tc>
+      </w:tr>
+      <w:tr>
+        <w:tblPrEx>
+          <w:tblCellMar>
+            <w:top w:w="0" w:type="dxa"/>
+            <w:bottom w:w="0" w:type="dxa"/>
+          </w:tblCellMar>
+        </w:tblPrEx>
+        <w:trPr>
+          <w:cantSplit/>
+        </w:trPr>
+        <w:tc>
+          <w:tcPr>
+            <w:tcW w:w="700" w:type="dxa"/>
+            <w:vAlign w:val="center"/>
+          </w:tcPr>
+          <w:p>
+            <w:r>
+              <w:t>1</w:t>
+            </w:r>
+          </w:p>
+        </w:tc>
+        <w:tc>
+          <w:tcPr>
+            <w:tcW w:w="4330" w:type="dxa"/>
+            <w:vAlign w:val="center"/>
+          </w:tcPr>
+          <w:p>
+            <w:r>
+              <w:t>—</w:t>
+            </w:r>
+          </w:p>
+        </w:tc>
+        <w:tc>
+          <w:tcPr>
+            <w:tcW w:w="4330" w:type="dxa"/>
+            <w:vAlign w:val="center"/>
+          </w:tcPr>
+          <w:p>
+            <w:r>
+              <w:t>Se cumple el ciclo de consulta del backend.</w:t>
+            </w:r>
+          </w:p>
+        </w:tc>
+      </w:tr>
+      <w:tr>
+        <w:tblPrEx>
+          <w:tblCellMar>
+            <w:top w:w="0" w:type="dxa"/>
+            <w:bottom w:w="0" w:type="dxa"/>
+          </w:tblCellMar>
+        </w:tblPrEx>
+        <w:trPr>
+          <w:cantSplit/>
+        </w:trPr>
+        <w:tc>
+          <w:tcPr>
+            <w:tcW w:w="700" w:type="dxa"/>
+            <w:vAlign w:val="center"/>
+          </w:tcPr>
+          <w:p>
+            <w:r>
+              <w:t>2</w:t>
+            </w:r>
+          </w:p>
+        </w:tc>
+        <w:tc>
+          <w:tcPr>
+            <w:tcW w:w="4330" w:type="dxa"/>
+            <w:vAlign w:val="center"/>
+          </w:tcPr>
+          <w:p>
+            <w:r>
+              <w:t>—</w:t>
+            </w:r>
+          </w:p>
+        </w:tc>
+        <w:tc>
+          <w:tcPr>
+            <w:tcW w:w="4330" w:type="dxa"/>
+            <w:vAlign w:val="center"/>
+          </w:tcPr>
+          <w:p>
+            <w:r>
+              <w:t>El backend identifica a Tarija en el catálogo de departamentos de ANH y pide el listado de estaciones de gasolina y el de diésel.</w:t>
+            </w:r>
+          </w:p>
+        </w:tc>
+      </w:tr>
+      <w:tr>
+        <w:tblPrEx>
+          <w:tblCellMar>
+            <w:top w:w="0" w:type="dxa"/>
+            <w:bottom w:w="0" w:type="dxa"/>
+          </w:tblCellMar>
+        </w:tblPrEx>
+        <w:trPr>
+          <w:cantSplit/>
+        </w:trPr>
+        <w:tc>
+          <w:tcPr>
+            <w:tcW w:w="700" w:type="dxa"/>
+            <w:vAlign w:val="center"/>
+          </w:tcPr>
+          <w:p>
+            <w:r>
+              <w:t>3</w:t>
+            </w:r>
+          </w:p>
+        </w:tc>
+        <w:tc>
+          <w:tcPr>
+            <w:tcW w:w="4330" w:type="dxa"/>
+            <w:vAlign w:val="center"/>
+          </w:tcPr>
+          <w:p>
+            <w:r>
+              <w:t>La API de ANH responde con las estaciones del departamento: ubicación, saldo en litros, estado (alto, medio o bajo) y fecha de actualización.</w:t>
+            </w:r>
+          </w:p>
+        </w:tc>
+        <w:tc>
+          <w:tcPr>
+            <w:tcW w:w="4330" w:type="dxa"/>
+            <w:vAlign w:val="center"/>
+          </w:tcPr>
+          <w:p>
+            <w:r>
+              <w:t>El backend recibe la respuesta de cada combustible.</w:t>
+            </w:r>
+          </w:p>
+        </w:tc>
+      </w:tr>
+      <w:tr>
+        <w:tblPrEx>
+          <w:tblCellMar>
+            <w:top w:w="0" w:type="dxa"/>
+            <w:bottom w:w="0" w:type="dxa"/>
+          </w:tblCellMar>
+        </w:tblPrEx>
+        <w:trPr>
+          <w:cantSplit/>
+        </w:trPr>
+        <w:tc>
+          <w:tcPr>
+            <w:tcW w:w="700" w:type="dxa"/>
+            <w:vAlign w:val="center"/>
+          </w:tcPr>
+          <w:p>
+            <w:r>
+              <w:t>4</w:t>
+            </w:r>
+          </w:p>
+        </w:tc>
+        <w:tc>
+          <w:tcPr>
+            <w:tcW w:w="4330" w:type="dxa"/>
+            <w:vAlign w:val="center"/>
+          </w:tcPr>
+          <w:p>
+            <w:r>
+              <w:t>—</w:t>
+            </w:r>
+          </w:p>
+        </w:tc>
+        <w:tc>
+          <w:tcPr>
+            <w:tcW w:w="4330" w:type="dxa"/>
+            <w:vAlign w:val="center"/>
+          </w:tcPr>
+          <w:p>
+            <w:r>
+              <w:t>El backend valida la respuesta: formato correcto, solo el departamento y el combustible pedidos y sin estaciones repetidas.</w:t>
+            </w:r>
+          </w:p>
+        </w:tc>
+      </w:tr>
+      <w:tr>
+        <w:tblPrEx>
+          <w:tblCellMar>
+            <w:top w:w="0" w:type="dxa"/>
+            <w:bottom w:w="0" w:type="dxa"/>
+          </w:tblCellMar>
+        </w:tblPrEx>
+        <w:trPr>
+          <w:cantSplit/>
+        </w:trPr>
+        <w:tc>
+          <w:tcPr>
+            <w:tcW w:w="700" w:type="dxa"/>
+            <w:vAlign w:val="center"/>
+          </w:tcPr>
+          <w:p>
+            <w:r>
+              <w:t>5</w:t>
+            </w:r>
+          </w:p>
+        </w:tc>
+        <w:tc>
+          <w:tcPr>
+            <w:tcW w:w="4330" w:type="dxa"/>
+            <w:vAlign w:val="center"/>
+          </w:tcPr>
+          <w:p>
+            <w:r>
+              <w:t>—</w:t>
+            </w:r>
+          </w:p>
+        </w:tc>
+        <w:tc>
+          <w:tcPr>
+            <w:tcW w:w="4330" w:type="dxa"/>
+            <w:vAlign w:val="center"/>
+          </w:tcPr>
+          <w:p>
+            <w:r>
+              <w:t>El backend ignora las estaciones que están fuera de la mancha urbana de Tarija o que no están vinculadas con un surtidor del catálogo.</w:t>
+            </w:r>
+          </w:p>
+        </w:tc>
+      </w:tr>
+      <w:tr>
+        <w:tblPrEx>
+          <w:tblCellMar>
+            <w:top w:w="0" w:type="dxa"/>
+            <w:bottom w:w="0" w:type="dxa"/>
+          </w:tblCellMar>
+        </w:tblPrEx>
+        <w:trPr>
+          <w:cantSplit/>
+        </w:trPr>
+        <w:tc>
+          <w:tcPr>
+            <w:tcW w:w="700" w:type="dxa"/>
+            <w:vAlign w:val="center"/>
+          </w:tcPr>
+          <w:p>
+            <w:r>
+              <w:t>6</w:t>
+            </w:r>
+          </w:p>
+        </w:tc>
+        <w:tc>
+          <w:tcPr>
+            <w:tcW w:w="4330" w:type="dxa"/>
+            <w:vAlign w:val="center"/>
+          </w:tcPr>
+          <w:p>
+            <w:r>
+              <w:t>—</w:t>
+            </w:r>
+          </w:p>
+        </w:tc>
+        <w:tc>
+          <w:tcPr>
+            <w:tcW w:w="4330" w:type="dxa"/>
+            <w:vAlign w:val="center"/>
+          </w:tcPr>
+          <w:p>
+            <w:r>
+              <w:t>Para cada estación vinculada, el backend traduce los litros (0 litros es agotado, más de 0 es disponible) y actualiza el estado del surtidor para ese tipo de combustible, con origen «ANH», los litros, el estado de ANH, la fecha que informa ANH y el momento de la lectura.</w:t>
+            </w:r>
+          </w:p>
+        </w:tc>
+      </w:tr>
+      <w:tr>
+        <w:tblPrEx>
+          <w:tblCellMar>
+            <w:top w:w="0" w:type="dxa"/>
+            <w:bottom w:w="0" w:type="dxa"/>
+          </w:tblCellMar>
+        </w:tblPrEx>
+        <w:trPr>
+          <w:cantSplit/>
+        </w:trPr>
+        <w:tc>
+          <w:tcPr>
+            <w:tcW w:w="700" w:type="dxa"/>
+            <w:vAlign w:val="center"/>
+          </w:tcPr>
+          <w:p>
+            <w:r>
+              <w:t>7</w:t>
+            </w:r>
+          </w:p>
+        </w:tc>
+        <w:tc>
+          <w:tcPr>
+            <w:tcW w:w="4330" w:type="dxa"/>
+            <w:vAlign w:val="center"/>
+          </w:tcPr>
+          <w:p>
+            <w:r>
+              <w:t>—</w:t>
+            </w:r>
+          </w:p>
+        </w:tc>
+        <w:tc>
+          <w:tcPr>
+            <w:tcW w:w="4330" w:type="dxa"/>
+            <w:vAlign w:val="center"/>
+          </w:tcPr>
+          <w:p>
+            <w:r>
+              <w:t>El estado actualizado queda disponible para las consultas de los conductores (CU-05). El backend deja en su registro el resumen del ciclo.</w:t>
+            </w:r>
+          </w:p>
+        </w:tc>
+      </w:tr>
+    </w:tbl>
+    <w:p>
+      <w:pPr>
+        <w:pStyle w:val="Ttulo1"/>
+        <w:keepNext/>
+        <w:spacing w:before="300" w:after="150"/>
+      </w:pPr>
+      <w:r>
+        <w:lastRenderedPageBreak/>
+        <w:t>5. Diagrama de Comportamiento UML</w:t>
+      </w:r>
+    </w:p>
+    <w:p>
+      <w:pPr>
+        <w:keepNext/>
+        <w:spacing w:before="120" w:after="60"/>
+        <w:jc w:val="center"/>
+      </w:pPr>
+      <w:r>
+        <w:rPr>
+          <w:noProof/>
+        </w:rPr>
+        <w:drawing>
+          <wp:inline distT="0" distB="0" distL="0" distR="0" wp14:anchorId="379F3C43" wp14:editId="72D7A7EF">
+            <wp:extent cx="5842229" cy="7315200"/>
+            <wp:effectExtent l="0" t="0" r="0" b="0"/>
+            <wp:docPr id="518" name="CU-06_actividad.png"/>
+            <wp:cNvGraphicFramePr>
+              <a:graphicFrameLocks xmlns:a="http://schemas.openxmlformats.org/drawingml/2006/main" noChangeAspect="1"/>
+            </wp:cNvGraphicFramePr>
+            <a:graphic xmlns:a="http://schemas.openxmlformats.org/drawingml/2006/main">
+              <a:graphicData uri="http://schemas.openxmlformats.org/drawingml/2006/picture">
+                <pic:pic xmlns:pic="http://schemas.openxmlformats.org/drawingml/2006/picture">
+                  <pic:nvPicPr>
+                    <pic:cNvPr id="512" name="CU-06_actividad.png"/>
+                    <pic:cNvPicPr/>
+                  </pic:nvPicPr>
+                  <pic:blipFill>
+                    <a:blip r:embed="rId24"/>
+                    <a:stretch>
+                      <a:fillRect/>
+                    </a:stretch>
+                  </pic:blipFill>
+                  <pic:spPr>
+                    <a:xfrm>
+                      <a:off x="0" y="0"/>
+                      <a:ext cx="5842229" cy="7315200"/>
+                    </a:xfrm>
+                    <a:prstGeom prst="rect">
+                      <a:avLst/>
+                    </a:prstGeom>
+                  </pic:spPr>
+                </pic:pic>
+              </a:graphicData>
+            </a:graphic>
+          </wp:inline>
+        </w:drawing>
+      </w:r>
+    </w:p>
+    <w:p>
+      <w:pPr>
+        <w:spacing w:after="160"/>
+        <w:jc w:val="center"/>
+      </w:pPr>
+      <w:r>
+        <w:rPr>
+          <w:i/>
+          <w:iCs/>
+          <w:sz w:val="18"/>
+          <w:szCs w:val="18"/>
+        </w:rPr>
+        <w:t>Diagrama de actividad de CU-09 (fuente: 03_des/01_Diagramas_de_comportamiento/CU-09_ConsultarEstadoANH.puml)</w:t>
+      </w:r>
+    </w:p>
+    <w:p>
+      <w:pPr>
+        <w:pStyle w:val="Ttulo1"/>
+        <w:keepNext/>
+        <w:spacing w:before="300" w:after="150"/>
+      </w:pPr>
+      <w:r>
+        <w:lastRenderedPageBreak/>
+        <w:t>6. Extensiones y Flujos Alternativos (¿Y si...?)</w:t>
+      </w:r>
+    </w:p>
+    <w:p>
+      <w:pPr>
+        <w:keepNext/>
+        <w:spacing w:after="150"/>
+      </w:pPr>
+      <w:r>
+        <w:t>Desviaciones del flujo principal debido a errores de validación, decisiones de negocio o problemas de entorno:</w:t>
+      </w:r>
+    </w:p>
+    <w:tbl>
+      <w:tblPr>
+        <w:tblW w:w="9360" w:type="dxa"/>
+        <w:tblBorders>
+          <w:top w:val="single" w:sz="4" w:space="0" w:color="auto"/>
+          <w:left w:val="single" w:sz="4" w:space="0" w:color="auto"/>
+          <w:bottom w:val="single" w:sz="4" w:space="0" w:color="auto"/>
+          <w:right w:val="single" w:sz="4" w:space="0" w:color="auto"/>
+          <w:insideH w:val="single" w:sz="4" w:space="0" w:color="auto"/>
+          <w:insideV w:val="single" w:sz="4" w:space="0" w:color="auto"/>
+        </w:tblBorders>
+        <w:tblCellMar>
+          <w:left w:w="10" w:type="dxa"/>
+          <w:right w:w="10" w:type="dxa"/>
+        </w:tblCellMar>
+        <w:tblLook w:val="04A0" w:firstRow="1" w:lastRow="0" w:firstColumn="1" w:lastColumn="0" w:noHBand="0" w:noVBand="1"/>
+      </w:tblPr>
+      <w:tblGrid>
+        <w:gridCol w:w="900"/>
+        <w:gridCol w:w="3730"/>
+        <w:gridCol w:w="4730"/>
+      </w:tblGrid>
+      <w:tr>
+        <w:tblPrEx>
+          <w:tblCellMar>
+            <w:top w:w="0" w:type="dxa"/>
+            <w:bottom w:w="0" w:type="dxa"/>
+          </w:tblCellMar>
+        </w:tblPrEx>
+        <w:trPr>
+          <w:cantSplit/>
+        </w:trPr>
+        <w:tc>
+          <w:tcPr>
+            <w:tcW w:w="900" w:type="dxa"/>
+            <w:shd w:val="clear" w:color="auto" w:fill="D9D9D9"/>
+            <w:vAlign w:val="center"/>
+          </w:tcPr>
+          <w:p>
+            <w:pPr>
+              <w:keepNext/>
+            </w:pPr>
+            <w:r>
+              <w:rPr>
+                <w:b/>
+                <w:bCs/>
+              </w:rPr>
+              <w:t>Paso Ref.</w:t>
+            </w:r>
+          </w:p>
+        </w:tc>
+        <w:tc>
+          <w:tcPr>
+            <w:tcW w:w="3730" w:type="dxa"/>
+            <w:shd w:val="clear" w:color="auto" w:fill="D9D9D9"/>
+            <w:vAlign w:val="center"/>
+          </w:tcPr>
+          <w:p>
+            <w:pPr>
+              <w:keepNext/>
+            </w:pPr>
+            <w:r>
+              <w:rPr>
+                <w:b/>
+                <w:bCs/>
+              </w:rPr>
+              <w:t>Condición de Desvío</w:t>
+            </w:r>
+          </w:p>
+        </w:tc>
+        <w:tc>
+          <w:tcPr>
+            <w:tcW w:w="4730" w:type="dxa"/>
+            <w:shd w:val="clear" w:color="auto" w:fill="D9D9D9"/>
+            <w:vAlign w:val="center"/>
+          </w:tcPr>
+          <w:p>
+            <w:pPr>
+              <w:keepNext/>
+            </w:pPr>
+            <w:r>
+              <w:rPr>
+                <w:b/>
+                <w:bCs/>
+              </w:rPr>
+              <w:t>Acción de Recuperación / Salida</w:t>
+            </w:r>
+          </w:p>
+        </w:tc>
+      </w:tr>
+      <w:tr>
+        <w:tblPrEx>
+          <w:tblCellMar>
+            <w:top w:w="0" w:type="dxa"/>
+            <w:bottom w:w="0" w:type="dxa"/>
+          </w:tblCellMar>
+        </w:tblPrEx>
+        <w:trPr>
+          <w:cantSplit/>
+        </w:trPr>
+        <w:tc>
+          <w:tcPr>
+            <w:tcW w:w="900" w:type="dxa"/>
+            <w:vAlign w:val="center"/>
+          </w:tcPr>
+          <w:p>
+            <w:r>
+              <w:t>2a</w:t>
+            </w:r>
+          </w:p>
+        </w:tc>
+        <w:tc>
+          <w:tcPr>
+            <w:tcW w:w="3730" w:type="dxa"/>
+            <w:vAlign w:val="center"/>
+          </w:tcPr>
+          <w:p>
+            <w:r>
+              <w:t>ANH no responde, se agota el tiempo de espera, responde con un error o su certificado no puede verificarse:</w:t>
+            </w:r>
+          </w:p>
+        </w:tc>
+        <w:tc>
+          <w:tcPr>
+            <w:tcW w:w="4730" w:type="dxa"/>
+            <w:vAlign w:val="center"/>
+          </w:tcPr>
+          <w:p>
+            <w:r>
+              <w:t>1. El backend reintenta la petición una vez (valor inicial), solo si falta conexión, se agota el tiempo o ANH responde con un error temporal; si ANH pide esperar, respeta ese plazo.</w:t>
+            </w:r>
+          </w:p>
+          <w:p>
+            <w:r>
+              <w:t>2. Si sigue fallando, no se actualiza ningún estado: cada surtidor conserva su último dato de ANH con su fecha.</w:t>
+            </w:r>
+          </w:p>
+          <w:p>
+            <w:r>
+              <w:t>3. Un fallo nunca se toma como cero litros, y un error de certificado nunca se salta: la consulta se detiene.</w:t>
+            </w:r>
+          </w:p>
+        </w:tc>
+      </w:tr>
+      <w:tr>
+        <w:tblPrEx>
+          <w:tblCellMar>
+            <w:top w:w="0" w:type="dxa"/>
+            <w:bottom w:w="0" w:type="dxa"/>
+          </w:tblCellMar>
+        </w:tblPrEx>
+        <w:trPr>
+          <w:cantSplit/>
+        </w:trPr>
+        <w:tc>
+          <w:tcPr>
+            <w:tcW w:w="900" w:type="dxa"/>
+            <w:vAlign w:val="center"/>
+          </w:tcPr>
+          <w:p>
+            <w:r>
+              <w:t>2b</w:t>
+            </w:r>
+          </w:p>
+        </w:tc>
+        <w:tc>
+          <w:tcPr>
+            <w:tcW w:w="3730" w:type="dxa"/>
+            <w:vAlign w:val="center"/>
+          </w:tcPr>
+          <w:p>
+            <w:r>
+              <w:t>ANH falla solo en uno de los dos combustibles:</w:t>
+            </w:r>
+          </w:p>
+        </w:tc>
+        <w:tc>
+          <w:tcPr>
+            <w:tcW w:w="4730" w:type="dxa"/>
+            <w:vAlign w:val="center"/>
+          </w:tcPr>
+          <w:p>
+            <w:r>
+              <w:t>1. El backend actualiza los surtidores con el combustible que sí respondió.</w:t>
+            </w:r>
+          </w:p>
+          <w:p>
+            <w:r>
+              <w:t>2. Los del otro combustible conservan su último dato.</w:t>
+            </w:r>
+          </w:p>
+        </w:tc>
+      </w:tr>
+      <w:tr>
+        <w:tblPrEx>
+          <w:tblCellMar>
+            <w:top w:w="0" w:type="dxa"/>
+            <w:bottom w:w="0" w:type="dxa"/>
+          </w:tblCellMar>
+        </w:tblPrEx>
+        <w:trPr>
+          <w:cantSplit/>
+        </w:trPr>
+        <w:tc>
+          <w:tcPr>
+            <w:tcW w:w="900" w:type="dxa"/>
+            <w:vAlign w:val="center"/>
+          </w:tcPr>
+          <w:p>
+            <w:r>
+              <w:t>4a</w:t>
+            </w:r>
+          </w:p>
+        </w:tc>
+        <w:tc>
+          <w:tcPr>
+            <w:tcW w:w="3730" w:type="dxa"/>
+            <w:vAlign w:val="center"/>
+          </w:tcPr>
+          <w:p>
+            <w:r>
+              <w:t>La respuesta no es válida o está incompleta (no es JSON, es demasiado grande, trae un código de error de ANH, estaciones de otro departamento o de otro combustible, estaciones repetidas o señales de paginación):</w:t>
+            </w:r>
+          </w:p>
+        </w:tc>
+        <w:tc>
+          <w:tcPr>
+            <w:tcW w:w="4730" w:type="dxa"/>
+            <w:vAlign w:val="center"/>
+          </w:tcPr>
+          <w:p>
+            <w:r>
+              <w:t>1. El backend descarta la respuesta completa.</w:t>
+            </w:r>
+          </w:p>
+          <w:p>
+            <w:r>
+              <w:t>2. No se actualiza ningún estado: cada surtidor conserva su último dato.</w:t>
+            </w:r>
+          </w:p>
+        </w:tc>
+      </w:tr>
+      <w:tr>
+        <w:tblPrEx>
+          <w:tblCellMar>
+            <w:top w:w="0" w:type="dxa"/>
+            <w:bottom w:w="0" w:type="dxa"/>
+          </w:tblCellMar>
+        </w:tblPrEx>
+        <w:trPr>
+          <w:cantSplit/>
+        </w:trPr>
+        <w:tc>
+          <w:tcPr>
+            <w:tcW w:w="900" w:type="dxa"/>
+            <w:vAlign w:val="center"/>
+          </w:tcPr>
+          <w:p>
+            <w:r>
+              <w:t>4b</w:t>
+            </w:r>
+          </w:p>
+        </w:tc>
+        <w:tc>
+          <w:tcPr>
+            <w:tcW w:w="3730" w:type="dxa"/>
+            <w:vAlign w:val="center"/>
+          </w:tcPr>
+          <w:p>
+            <w:r>
+              <w:t>El saldo de una estación no es un número válido o es negativo:</w:t>
+            </w:r>
+          </w:p>
+        </w:tc>
+        <w:tc>
+          <w:tcPr>
+            <w:tcW w:w="4730" w:type="dxa"/>
+            <w:vAlign w:val="center"/>
+          </w:tcPr>
+          <w:p>
+            <w:r>
+              <w:t>1. El backend lo trata como «sin saldo».</w:t>
+            </w:r>
+          </w:p>
+          <w:p>
+            <w:r>
+              <w:t>2. Los demás datos de la respuesta siguen su curso.</w:t>
+            </w:r>
+          </w:p>
+        </w:tc>
+      </w:tr>
+      <w:tr>
+        <w:tblPrEx>
+          <w:tblCellMar>
+            <w:top w:w="0" w:type="dxa"/>
+            <w:bottom w:w="0" w:type="dxa"/>
+          </w:tblCellMar>
+        </w:tblPrEx>
+        <w:trPr>
+          <w:cantSplit/>
+        </w:trPr>
+        <w:tc>
+          <w:tcPr>
+            <w:tcW w:w="900" w:type="dxa"/>
+            <w:vAlign w:val="center"/>
+          </w:tcPr>
+          <w:p>
+            <w:r>
+              <w:t>5a</w:t>
+            </w:r>
+          </w:p>
+        </w:tc>
+        <w:tc>
+          <w:tcPr>
+            <w:tcW w:w="3730" w:type="dxa"/>
+            <w:vAlign w:val="center"/>
+          </w:tcPr>
+          <w:p>
+            <w:r>
+              <w:t>Una estación de ANH está fuera de la mancha urbana de Tarija (ANH devuelve todo el departamento, también Bermejo, Yacuiba y otras ciudades):</w:t>
+            </w:r>
+          </w:p>
+        </w:tc>
+        <w:tc>
+          <w:tcPr>
+            <w:tcW w:w="4730" w:type="dxa"/>
+            <w:vAlign w:val="center"/>
+          </w:tcPr>
+          <w:p>
+            <w:r>
+              <w:t>1. El backend la ignora.</w:t>
+            </w:r>
+          </w:p>
+          <w:p>
+            <w:r>
+              <w:t>2. No se guarda nada de ella.</w:t>
+            </w:r>
+          </w:p>
+        </w:tc>
+      </w:tr>
+      <w:tr>
+        <w:tblPrEx>
+          <w:tblCellMar>
+            <w:top w:w="0" w:type="dxa"/>
+            <w:bottom w:w="0" w:type="dxa"/>
+          </w:tblCellMar>
+        </w:tblPrEx>
+        <w:trPr>
+          <w:cantSplit/>
+        </w:trPr>
+        <w:tc>
+          <w:tcPr>
+            <w:tcW w:w="900" w:type="dxa"/>
+            <w:vAlign w:val="center"/>
+          </w:tcPr>
+          <w:p>
+            <w:r>
+              <w:t>5b</w:t>
+            </w:r>
+          </w:p>
+        </w:tc>
+        <w:tc>
+          <w:tcPr>
+            <w:tcW w:w="3730" w:type="dxa"/>
+            <w:vAlign w:val="center"/>
+          </w:tcPr>
+          <w:p>
+            <w:r>
+              <w:t>Una estación de ANH no está vinculada con ningún surtidor del catálogo:</w:t>
+            </w:r>
+          </w:p>
+        </w:tc>
+        <w:tc>
+          <w:tcPr>
+            <w:tcW w:w="4730" w:type="dxa"/>
+            <w:vAlign w:val="center"/>
+          </w:tcPr>
+          <w:p>
+            <w:r>
+              <w:t>1. El backend la ignora.</w:t>
+            </w:r>
+          </w:p>
+          <w:p>
+            <w:r>
+              <w:t>2. Si está dentro de la mancha urbana, la anota en su registro como candidata a entrar al catálogo.</w:t>
+            </w:r>
+          </w:p>
+        </w:tc>
+      </w:tr>
+      <w:tr>
+        <w:tblPrEx>
+          <w:tblCellMar>
+            <w:top w:w="0" w:type="dxa"/>
+            <w:bottom w:w="0" w:type="dxa"/>
+          </w:tblCellMar>
+        </w:tblPrEx>
+        <w:trPr>
+          <w:cantSplit/>
+        </w:trPr>
+        <w:tc>
+          <w:tcPr>
+            <w:tcW w:w="900" w:type="dxa"/>
+            <w:vAlign w:val="center"/>
+          </w:tcPr>
+          <w:p>
+            <w:r>
+              <w:t>6a</w:t>
+            </w:r>
+          </w:p>
+        </w:tc>
+        <w:tc>
+          <w:tcPr>
+            <w:tcW w:w="3730" w:type="dxa"/>
+            <w:vAlign w:val="center"/>
+          </w:tcPr>
+          <w:p>
+            <w:r>
+              <w:t>Una estación llega sin saldo (o con un saldo no válido) o sin fecha de actualización:</w:t>
+            </w:r>
+          </w:p>
+        </w:tc>
+        <w:tc>
+          <w:tcPr>
+            <w:tcW w:w="4730" w:type="dxa"/>
+            <w:vAlign w:val="center"/>
+          </w:tcPr>
+          <w:p>
+            <w:r>
+              <w:t>1. El backend no crea ni cambia ningún estado para esa estación y ese combustible.</w:t>
+            </w:r>
+          </w:p>
+          <w:p>
+            <w:r>
+              <w:t>2. El surtidor conserva su dato anterior.</w:t>
+            </w:r>
+          </w:p>
+        </w:tc>
+      </w:tr>
+      <w:tr>
+        <w:tblPrEx>
+          <w:tblCellMar>
+            <w:top w:w="0" w:type="dxa"/>
+            <w:bottom w:w="0" w:type="dxa"/>
+          </w:tblCellMar>
+        </w:tblPrEx>
+        <w:trPr>
+          <w:cantSplit/>
+        </w:trPr>
+        <w:tc>
+          <w:tcPr>
+            <w:tcW w:w="900" w:type="dxa"/>
+            <w:vAlign w:val="center"/>
+          </w:tcPr>
+          <w:p>
+            <w:r>
+              <w:t>6b</w:t>
+            </w:r>
+          </w:p>
+        </w:tc>
+        <w:tc>
+          <w:tcPr>
+            <w:tcW w:w="3730" w:type="dxa"/>
+            <w:vAlign w:val="center"/>
+          </w:tcPr>
+          <w:p>
+            <w:r>
+              <w:t>Ya hay un dato de ANH más reciente para ese surtidor y combustible:</w:t>
+            </w:r>
+          </w:p>
+        </w:tc>
+        <w:tc>
+          <w:tcPr>
+            <w:tcW w:w="4730" w:type="dxa"/>
+            <w:vAlign w:val="center"/>
+          </w:tcPr>
+          <w:p>
+            <w:r>
+              <w:t>1. El backend no reemplaza el dato guardado.</w:t>
+            </w:r>
+          </w:p>
+          <w:p>
+            <w:r>
+              <w:t>2. Si la fecha es la misma, solo actualiza el momento de la lectura.</w:t>
+            </w:r>
+          </w:p>
+        </w:tc>
+      </w:tr>
+    </w:tbl>
+    <w:p>
+      <w:pPr>
+        <w:pStyle w:val="Ttulo1"/>
+        <w:keepNext/>
+        <w:spacing w:before="300" w:after="150"/>
+      </w:pPr>
+      <w:r>
+        <w:t>7. Requisitos Especiales (No Funcionales específicos)</w:t>
+      </w:r>
+    </w:p>
+    <w:p>
+      <w:pPr>
+        <w:spacing w:after="80"/>
+      </w:pPr>
+      <w:r>
+        <w:t>Rendimiento: El dato de ANH se actualiza en cada consulta periódica del backend. Cada petición espera como máximo el tiempo de espera definido (valor inicial: 12 segundos) y no retrasa las consultas de los conductores.</w:t>
+      </w:r>
+    </w:p>
+    <w:p>
+      <w:pPr>
+        <w:spacing w:after="80"/>
+      </w:pPr>
+      <w:r>
+        <w:t>Usabilidad: No aplica de forma directa; es un proceso automático sin interacción del conductor. El dato de ANH se muestra en CU-05 con su origen, su saldo en litros y su estado.</w:t>
+      </w:r>
+    </w:p>
+    <w:p>
+      <w:pPr>
+        <w:spacing w:after="80"/>
+      </w:pPr>
+      <w:r>
+        <w:t>Seguridad: Las llamadas a ANH son solo lecturas (GET) por HTTPS, sin credenciales, y verifican siempre el certificado: esa verificación nunca se desactiva. La respuesta se valida antes de usarse y solo el backend consulta a ANH.</w:t>
+      </w:r>
+    </w:p>
+    <w:p>
+      <w:pPr>
+        <w:spacing w:after="80"/>
+      </w:pPr>
+      <w:r>
+        <w:t>Privacidad: Los datos de ANH son públicos y no incluyen datos de personas. No se envía a ANH ningún dato de los conductores. No se guardan las respuestas completas, la fecha de última venta, la dirección de la estación ni las estaciones ignoradas; el registro de cada ciclo guarda solo un resumen. La política de privacidad menciona el uso de datos de ANH.</w:t>
+      </w:r>
+    </w:p>
+    <w:p>
+      <w:pPr>
+        <w:spacing w:after="80"/>
+      </w:pPr>
+      <w:r>
+        <w:t>Dependencia externa: ANH no publica condiciones de uso, cuotas ni garantía de disponibilidad, y su respuesta puede cambiar sin aviso. Por eso el sistema solo hace las consultas necesarias y, si ANH falla, el monitoreo de WhatsApp y las confirmaciones de los conductores siguen funcionando.</w:t>
+      </w:r>
+    </w:p>
+    <w:p>
+      <w:pPr>
+        <w:pStyle w:val="Ttulo1"/>
+        <w:keepNext/>
+        <w:spacing w:before="300" w:after="150"/>
+      </w:pPr>
+      <w:r>
+        <w:t>8. Variaciones de Tecnología y Datos</w:t>
+      </w:r>
+    </w:p>
+    <w:p>
+      <w:pPr>
+        <w:spacing w:after="80"/>
+      </w:pPr>
+      <w:r>
+        <w:t>Servicio consultado: la API pública de ANH Abastecimiento, solo con lecturas: el catálogo de departamentos y el listado de estaciones por departamento y por combustible (gasolina y diésel). De cada estación se leen su ubicación, el saldo en litros, el estado (alto, medio o bajo) y la fecha de actualización.</w:t>
+      </w:r>
+    </w:p>
+    <w:p>
+      <w:pPr>
+        <w:spacing w:after="80"/>
+      </w:pPr>
+      <w:r>
+        <w:t>Vínculo con el catálogo: cada estación de ANH se vincula con un surtidor por su identificador de ANH, que el equipo fija comparando el nombre y la ubicación y revisa a mano. Un surtidor tiene a lo sumo una estación de ANH.</w:t>
+      </w:r>
+    </w:p>
+    <w:p>
+      <w:pPr>
+        <w:spacing w:after="80"/>
+      </w:pPr>
+      <w:r>
+        <w:t>Traducción de los litros: 0 litros es agotado, más de 0 litros es disponible y sin saldo es sin dato. El estado de ANH (alto, medio o bajo) se guarda y se muestra tal como llega: no cambia la disponibilidad.</w:t>
+      </w:r>
+    </w:p>
+    <w:p>
+      <w:pPr>
+        <w:spacing w:after="80"/>
+      </w:pPr>
+      <w:r>
+        <w:t>Fecha y vigencia: la fecha del dato es la que informa ANH; si no trae zona horaria se toma la de Tarija, y si falta, el dato no se guarda. El dato vence según la vigencia de CU-05 (sección 8), contada desde la última lectura del backend. ANH no informa cuándo llegó combustible a una estación y el sistema nunca inventa esa fecha.</w:t>
+      </w:r>
+    </w:p>
+    <w:p>
+      <w:pPr>
+        <w:spacing w:after="80"/>
+      </w:pPr>
+      <w:r>
+        <w:t>Valores iniciales (a ajustar con las pruebas de la integración): intervalo entre consultas, tiempo de espera de 12 segundos, un reintento y una pausa de un segundo entre peticiones.</w:t>
+      </w:r>
+    </w:p>
+    <w:p>
+      <w:pPr>
+        <w:spacing w:after="80"/>
+      </w:pPr>
+      <w:r>
+        <w:t>El programa de prueba en Python de 05_pro/PruebaApiANH es solo una referencia: la consulta real la hace el backend Java.</w:t>
       </w:r>
     </w:p>
     <w:sectPr>

</xml_diff>